<commit_message>
docs(guia-01): la FPI-17 aclara que el MVP no tiene aún un gimnasio aliado específico
Co-Authored-By: Claude Opus 5.5 <noreply@anthropic.com>
Claude-Session: https://claude.ai/code/session_01CgRjTNNy7k8MQdpVgHeNej
</commit_message>
<xml_diff>
--- a/docs/guia-01-sw2/Guia_1_SW2_Evaluacion_Sistemas_Heredados_resuelta.docx
+++ b/docs/guia-01-sw2/Guia_1_SW2_Evaluacion_Sistemas_Heredados_resuelta.docx
@@ -8327,7 +8327,7 @@
               <w:rPr>
                 <w:rFonts w:ascii="Calibri" w:cs="Calibri" w:eastAsia="Calibri" w:hAnsi="Calibri"/>
               </w:rPr>
-              <w:t xml:space="preserve"> FitManage es una aplicación web responsive para un gimnasio MiPyme de Cúcuta que centraliza el ciclo de la membresía: cuentas del personal por rol, registro de socios con autorización de datos, planes, pagos con vencimiento automático y renovación anticipada, consulta del estado por documento (con caché de solo lectura sin conexión), anulación auditada de pagos y reporte de ingresos y vencimientos. Los requisitos están aprobados en el ERS, la arquitectura en el DAD (monolito modular con arquitectura limpia: Django 5.2, PostgreSQL 16 y Bootstrap 5.3) y el diseño detallado en el DDS.</w:t>
+              <w:t xml:space="preserve"> FitManage es una aplicación web responsive para gimnasios MiPyme de Cúcuta que centraliza el ciclo de la membresía: cuentas del personal por rol, registro de socios con autorización de datos, planes, pagos con vencimiento automático y renovación anticipada, consulta del estado por documento (con caché de solo lectura sin conexión), anulación auditada de pagos y reporte de ingresos y vencimientos. Los requisitos están aprobados en el ERS, la arquitectura en el DAD (monolito modular con arquitectura limpia: Django 5.2, PostgreSQL 16 y Bootstrap 5.3) y el diseño detallado en el DDS.</w:t>
             </w:r>
           </w:p>
           <w:p>
@@ -9175,15 +9175,28 @@
           </w:tcPr>
           <w:p>
             <w:pPr>
-              <w:spacing w:after="0"/>
-            </w:pPr>
-            <w:r>
-              <w:rPr>
-                <w:rFonts w:ascii="Calibri" w:cs="Calibri" w:eastAsia="Calibri" w:hAnsi="Calibri"/>
-                <w:sz w:val="19"/>
-                <w:szCs w:val="19"/>
-              </w:rPr>
-              <w:t xml:space="preserve">Gimnasio MiPyme de Cúcuta (Norte de Santander), representado por su dueño y su recepcionista, usuarios principales del MVP.</w:t>
+              <w:spacing w:after="60"/>
+            </w:pPr>
+            <w:r>
+              <w:rPr>
+                <w:rFonts w:ascii="Calibri" w:cs="Calibri" w:eastAsia="Calibri" w:hAnsi="Calibri"/>
+                <w:sz w:val="19"/>
+                <w:szCs w:val="19"/>
+              </w:rPr>
+              <w:t xml:space="preserve">Sin un gimnasio aliado específico todavía. FitManage está dirigido a los gimnasios MiPyme independientes de Cúcuta y Norte de Santander, que comparten el mismo problema: membresías, cobros y acceso controlados con cuadernos y hojas de cálculo.</w:t>
+            </w:r>
+          </w:p>
+          <w:p>
+            <w:pPr>
+              <w:spacing w:after="0"/>
+            </w:pPr>
+            <w:r>
+              <w:rPr>
+                <w:rFonts w:ascii="Calibri" w:cs="Calibri" w:eastAsia="Calibri" w:hAnsi="Calibri"/>
+                <w:sz w:val="19"/>
+                <w:szCs w:val="19"/>
+              </w:rPr>
+              <w:t xml:space="preserve">El perfil de cliente que guía los requisitos es el dueño del gimnasio (administrador) y su recepcionista (usuaria principal). Por eso el nombre del gimnasio es un dato configurable del sistema y no está escrito en el código.</w:t>
             </w:r>
           </w:p>
         </w:tc>

</xml_diff>

<commit_message>
docs(guia-01): redacción más clara y en primera persona de las respuestas de la guía 1
Co-Authored-By: Claude Opus 5.5 <noreply@anthropic.com>
Claude-Session: https://claude.ai/code/session_01CgRjTNNy7k8MQdpVgHeNej
</commit_message>
<xml_diff>
--- a/docs/guia-01-sw2/Guia_1_SW2_Evaluacion_Sistemas_Heredados_resuelta.docx
+++ b/docs/guia-01-sw2/Guia_1_SW2_Evaluacion_Sistemas_Heredados_resuelta.docx
@@ -1777,7 +1777,7 @@
         <w:rPr>
           <w:rFonts w:ascii="Calibri" w:cs="Calibri" w:eastAsia="Calibri" w:hAnsi="Calibri"/>
         </w:rPr>
-        <w:t xml:space="preserve">Porque no se puede proteger ni mejorar lo que no se ha medido. La línea base es una fotografía aprobada del sistema (código, dependencias, cobertura de pruebas, vulnerabilidades y arquitectura) que queda congelada y solo cambia mediante control de cambios formal. Sirve para tres cosas: saber con exactitud qué se heredó antes de tocarlo, medir después si cada mantenimiento mejoró o degradó la calidad, y poder volver a una versión conocida cuando un cambio rompe algo. Sin ella, cualquier mantenimiento correctivo, adaptativo o perfectivo es una apuesta: no habría forma objetiva de demostrar que el sistema evolucionó en lugar de empeorar.</w:t>
+        <w:t xml:space="preserve">Antes de mantener un sistema hay que saber en qué estado está. La línea base es una foto aprobada del sistema (código, dependencias, cobertura de pruebas, vulnerabilidades y arquitectura) que queda congelada y solo se modifica con control de cambios. Con ella sé exactamente qué heredé, puedo comparar después si cada mantenimiento mejoró o empeoró la calidad y puedo volver a una versión conocida si un cambio daña algo. Sin línea base, un mantenimiento correctivo, adaptativo o perfectivo no se puede evaluar, porque no hay contra qué medir el resultado.</w:t>
       </w:r>
     </w:p>
     <w:p>
@@ -1822,7 +1822,7 @@
         <w:rPr>
           <w:rFonts w:ascii="Calibri" w:cs="Calibri" w:eastAsia="Calibri" w:hAnsi="Calibri"/>
         </w:rPr>
-        <w:t xml:space="preserve">Los cinco ejemplos son reales: salen de la auditoría de mi propio MVP (FitManage), con su ubicación en el repositorio.</w:t>
+        <w:t xml:space="preserve">Tomé los ejemplos de la auditoría de mi propio MVP, FitManage, así que todos son reales y tienen su ubicación en el repositorio. Agregué uno de infraestructura porque la guía lo menciona en la tabla de tipos.</w:t>
       </w:r>
     </w:p>
     <w:tbl>
@@ -2022,7 +2022,7 @@
                 <w:sz w:val="19"/>
                 <w:szCs w:val="19"/>
               </w:rPr>
-              <w:t xml:space="preserve">, líneas 348–372), con complejidad ciclomática 23 medida con lizard.</w:t>
+              <w:t xml:space="preserve">, líneas 348 a 372). lizard le mide una complejidad ciclomática de 23.</w:t>
             </w:r>
           </w:p>
         </w:tc>
@@ -2052,7 +2052,7 @@
                 <w:sz w:val="19"/>
                 <w:szCs w:val="19"/>
               </w:rPr>
-              <w:t xml:space="preserve">Funciona, pero para probarla completa harían falta al menos 23 casos y cualquier botón nuevo agranda la misma función.</w:t>
+              <w:t xml:space="preserve">La función sirve, pero probarla completa exige al menos 23 casos, y cada botón nuevo la hace más grande.</w:t>
             </w:r>
           </w:p>
         </w:tc>
@@ -2117,7 +2117,7 @@
                 <w:sz w:val="19"/>
                 <w:szCs w:val="19"/>
               </w:rPr>
-              <w:t xml:space="preserve">El prototipo calcula el vencimiento (</w:t>
+              <w:t xml:space="preserve">El prototipo calcula el vencimiento por su cuenta (</w:t>
             </w:r>
             <w:r>
               <w:rPr>
@@ -2133,7 +2133,7 @@
                 <w:sz w:val="19"/>
                 <w:szCs w:val="19"/>
               </w:rPr>
-              <w:t xml:space="preserve">, línea 216) y fija a mano la fecha de inicio de la renovación (línea 215), duplicando lo que ya hace </w:t>
+              <w:t xml:space="preserve">, línea 216) y tiene escrita a mano la fecha de inicio de la renovación (línea 215). Eso mismo ya lo hace </w:t>
             </w:r>
             <w:r>
               <w:rPr>
@@ -2179,7 +2179,7 @@
                 <w:sz w:val="19"/>
                 <w:szCs w:val="19"/>
               </w:rPr>
-              <w:t xml:space="preserve">Hay dos fuentes de verdad para la misma regla de dinero; si cambia RN-03, hay que corregirla en dos lugares y es fácil que difieran.</w:t>
+              <w:t xml:space="preserve">La misma regla de dinero queda en dos lugares. Si cambia RN-03 hay que corregirla dos veces, y es fácil que las dos versiones terminen dando resultados distintos.</w:t>
             </w:r>
           </w:p>
         </w:tc>
@@ -2260,7 +2260,7 @@
                 <w:sz w:val="19"/>
                 <w:szCs w:val="19"/>
               </w:rPr>
-              <w:t xml:space="preserve">); ninguna se ejecuta contra PostgreSQL.</w:t>
+              <w:t xml:space="preserve">). Ninguna corre contra PostgreSQL.</w:t>
             </w:r>
           </w:p>
         </w:tc>
@@ -2290,7 +2290,7 @@
                 <w:sz w:val="19"/>
                 <w:szCs w:val="19"/>
               </w:rPr>
-              <w:t xml:space="preserve">No está verificado cómo se comportan los montos </w:t>
+              <w:t xml:space="preserve">Todavía no sé cómo se comportan con la base de datos real los montos </w:t>
             </w:r>
             <w:r>
               <w:rPr>
@@ -2306,7 +2306,7 @@
                 <w:sz w:val="19"/>
                 <w:szCs w:val="19"/>
               </w:rPr>
-              <w:t xml:space="preserve">, la unicidad del comprobante ni la zona horaria con la base de datos real.</w:t>
+              <w:t xml:space="preserve">, la unicidad del comprobante y la zona horaria.</w:t>
             </w:r>
           </w:p>
         </w:tc>
@@ -2371,7 +2371,7 @@
                 <w:sz w:val="19"/>
                 <w:szCs w:val="19"/>
               </w:rPr>
-              <w:t xml:space="preserve">El control de acceso por rol existe solo en el navegador (</w:t>
+              <w:t xml:space="preserve">El control de acceso por rol solo existe en el navegador (</w:t>
             </w:r>
             <w:r>
               <w:rPr>
@@ -2387,7 +2387,7 @@
                 <w:sz w:val="19"/>
                 <w:szCs w:val="19"/>
               </w:rPr>
-              <w:t xml:space="preserve">, líneas 116 y 316) y el código trae la contraseña de demostración </w:t>
+              <w:t xml:space="preserve">, líneas 116 y 316), y el código trae la contraseña de demostración </w:t>
             </w:r>
             <w:r>
               <w:rPr>
@@ -2433,7 +2433,7 @@
                 <w:sz w:val="19"/>
                 <w:szCs w:val="19"/>
               </w:rPr>
-              <w:t xml:space="preserve">Cualquier persona puede saltarse la restricción desde las herramientas del navegador; RNF-05 exige que el servidor responda 403.</w:t>
+              <w:t xml:space="preserve">Cualquiera puede saltarse la restricción con las herramientas del navegador. RNF-05 pide que sea el servidor el que responda 403.</w:t>
             </w:r>
           </w:p>
         </w:tc>
@@ -2498,7 +2498,7 @@
                 <w:sz w:val="19"/>
                 <w:szCs w:val="19"/>
               </w:rPr>
-              <w:t xml:space="preserve">Hasta esta semana el núcleo vivía en un </w:t>
+              <w:t xml:space="preserve">Hasta esta semana el núcleo estaba guardado en un </w:t>
             </w:r>
             <w:r>
               <w:rPr>
@@ -2514,7 +2514,7 @@
                 <w:sz w:val="19"/>
                 <w:szCs w:val="19"/>
               </w:rPr>
-              <w:t xml:space="preserve"> sin control de versiones. El archivo se perdió y hubo que reconstruir el código a partir de la FPI-12.</w:t>
+              <w:t xml:space="preserve">, sin control de versiones. El archivo se perdió y tuve que reconstruir el código a partir de la FPI-12.</w:t>
             </w:r>
           </w:p>
         </w:tc>
@@ -2544,7 +2544,7 @@
                 <w:sz w:val="19"/>
                 <w:szCs w:val="19"/>
               </w:rPr>
-              <w:t xml:space="preserve">Sin repositorio ni integración continua no hay historia, no se puede volver a una versión anterior y la evidencia del trabajo se puede perder.</w:t>
+              <w:t xml:space="preserve">Sin repositorio ni integración continua no queda historial, no se puede volver a una versión anterior y la evidencia del trabajo se puede perder, como pasó.</w:t>
             </w:r>
           </w:p>
         </w:tc>
@@ -2934,7 +2934,7 @@
         <w:rPr>
           <w:rFonts w:ascii="Calibri" w:cs="Calibri" w:eastAsia="Calibri" w:hAnsi="Calibri"/>
         </w:rPr>
-        <w:t xml:space="preserve">Al pasar el fragmento por bandit, la herramienta marca dos posibles inyecciones SQL (regla B608, líneas 10 y 15). No detecta la clave de PayU, porque la variable se llama </w:t>
+        <w:t xml:space="preserve">Pasé el fragmento por bandit y marcó dos posibles inyecciones SQL (regla B608, líneas 10 y 15). La clave de PayU no la detectó, porque la variable se llama </w:t>
       </w:r>
       <w:r>
         <w:rPr>
@@ -2948,7 +2948,7 @@
         <w:rPr>
           <w:rFonts w:ascii="Calibri" w:cs="Calibri" w:eastAsia="Calibri" w:hAnsi="Calibri"/>
         </w:rPr>
-        <w:t xml:space="preserve"> y no </w:t>
+        <w:t xml:space="preserve"> y bandit busca nombres como </w:t>
       </w:r>
       <w:r>
         <w:rPr>
@@ -2962,7 +2962,7 @@
         <w:rPr>
           <w:rFonts w:ascii="Calibri" w:cs="Calibri" w:eastAsia="Calibri" w:hAnsi="Calibri"/>
         </w:rPr>
-        <w:t xml:space="preserve">: el resto de hallazgos salió de la revisión manual.</w:t>
+        <w:t xml:space="preserve">. Los demás problemas los encontré revisando el código a mano.</w:t>
       </w:r>
     </w:p>
     <w:tbl>
@@ -3177,12 +3177,18 @@
             <w:r>
               <w:rPr>
                 <w:rFonts w:ascii="Calibri" w:cs="Calibri" w:eastAsia="Calibri" w:hAnsi="Calibri"/>
-                <w:b/>
-                <w:bCs/>
                 <w:sz w:val="18"/>
                 <w:szCs w:val="18"/>
               </w:rPr>
-              <w:t xml:space="preserve">Inyección SQL.</w:t>
+              <w:t xml:space="preserve">Inyección SQL. Las dos consultas se arman con f-strings: el </w:t>
+            </w:r>
+            <w:r>
+              <w:rPr>
+                <w:rFonts w:ascii="Consolas" w:cs="Consolas" w:eastAsia="Consolas" w:hAnsi="Consolas"/>
+                <w:sz w:val="17"/>
+                <w:szCs w:val="17"/>
+              </w:rPr>
+              <w:t xml:space="preserve">SELECT</w:t>
             </w:r>
             <w:r>
               <w:rPr>
@@ -3190,15 +3196,15 @@
                 <w:sz w:val="18"/>
                 <w:szCs w:val="18"/>
               </w:rPr>
-              <w:t xml:space="preserve"> Las dos consultas se arman con f-strings: el </w:t>
-            </w:r>
-            <w:r>
-              <w:rPr>
-                <w:rFonts w:ascii="Consolas" w:cs="Consolas" w:eastAsia="Consolas" w:hAnsi="Consolas"/>
-                <w:sz w:val="17"/>
-                <w:szCs w:val="17"/>
-              </w:rPr>
-              <w:t xml:space="preserve">SELECT</w:t>
+              <w:t xml:space="preserve"> con </w:t>
+            </w:r>
+            <w:r>
+              <w:rPr>
+                <w:rFonts w:ascii="Consolas" w:cs="Consolas" w:eastAsia="Consolas" w:hAnsi="Consolas"/>
+                <w:sz w:val="17"/>
+                <w:szCs w:val="17"/>
+              </w:rPr>
+              <w:t xml:space="preserve">referencia_zapato</w:t>
             </w:r>
             <w:r>
               <w:rPr>
@@ -3206,15 +3212,15 @@
                 <w:sz w:val="18"/>
                 <w:szCs w:val="18"/>
               </w:rPr>
-              <w:t xml:space="preserve"> con </w:t>
-            </w:r>
-            <w:r>
-              <w:rPr>
-                <w:rFonts w:ascii="Consolas" w:cs="Consolas" w:eastAsia="Consolas" w:hAnsi="Consolas"/>
-                <w:sz w:val="17"/>
-                <w:szCs w:val="17"/>
-              </w:rPr>
-              <w:t xml:space="preserve">referencia_zapato</w:t>
+              <w:t xml:space="preserve"> y el </w:t>
+            </w:r>
+            <w:r>
+              <w:rPr>
+                <w:rFonts w:ascii="Consolas" w:cs="Consolas" w:eastAsia="Consolas" w:hAnsi="Consolas"/>
+                <w:sz w:val="17"/>
+                <w:szCs w:val="17"/>
+              </w:rPr>
+              <w:t xml:space="preserve">INSERT</w:t>
             </w:r>
             <w:r>
               <w:rPr>
@@ -3222,109 +3228,83 @@
                 <w:sz w:val="18"/>
                 <w:szCs w:val="18"/>
               </w:rPr>
-              <w:t xml:space="preserve"> y el </w:t>
-            </w:r>
-            <w:r>
-              <w:rPr>
-                <w:rFonts w:ascii="Consolas" w:cs="Consolas" w:eastAsia="Consolas" w:hAnsi="Consolas"/>
-                <w:sz w:val="17"/>
-                <w:szCs w:val="17"/>
-              </w:rPr>
-              <w:t xml:space="preserve">INSERT</w:t>
-            </w:r>
+              <w:t xml:space="preserve"> con el nombre y la cédula del cliente.</w:t>
+            </w:r>
+          </w:p>
+        </w:tc>
+        <w:tc>
+          <w:tcPr>
+            <w:tcW w:type="dxa" w:w="3500"/>
+            <w:tcBorders>
+              <w:top w:val="single" w:color="999999" w:sz="4"/>
+              <w:left w:val="single" w:color="999999" w:sz="4"/>
+              <w:bottom w:val="single" w:color="999999" w:sz="4"/>
+              <w:right w:val="single" w:color="999999" w:sz="4"/>
+            </w:tcBorders>
+            <w:tcMar>
+              <w:top w:type="dxa" w:w="80"/>
+              <w:left w:type="dxa" w:w="100"/>
+              <w:bottom w:type="dxa" w:w="80"/>
+              <w:right w:type="dxa" w:w="100"/>
+            </w:tcMar>
+          </w:tcPr>
+          <w:p>
+            <w:pPr>
+              <w:spacing w:after="0"/>
+            </w:pPr>
             <w:r>
               <w:rPr>
                 <w:rFonts w:ascii="Calibri" w:cs="Calibri" w:eastAsia="Calibri" w:hAnsi="Calibri"/>
                 <w:sz w:val="18"/>
                 <w:szCs w:val="18"/>
               </w:rPr>
-              <w:t xml:space="preserve"> con el nombre y la cédula del cliente.</w:t>
-            </w:r>
-          </w:p>
-        </w:tc>
-        <w:tc>
-          <w:tcPr>
-            <w:tcW w:type="dxa" w:w="3500"/>
-            <w:tcBorders>
-              <w:top w:val="single" w:color="999999" w:sz="4"/>
-              <w:left w:val="single" w:color="999999" w:sz="4"/>
-              <w:bottom w:val="single" w:color="999999" w:sz="4"/>
-              <w:right w:val="single" w:color="999999" w:sz="4"/>
-            </w:tcBorders>
-            <w:tcMar>
-              <w:top w:type="dxa" w:w="80"/>
-              <w:left w:type="dxa" w:w="100"/>
-              <w:bottom w:type="dxa" w:w="80"/>
-              <w:right w:type="dxa" w:w="100"/>
-            </w:tcMar>
-          </w:tcPr>
-          <w:p>
-            <w:pPr>
-              <w:spacing w:after="0"/>
-            </w:pPr>
+              <w:t xml:space="preserve">Con una referencia como </w:t>
+            </w:r>
+            <w:r>
+              <w:rPr>
+                <w:rFonts w:ascii="Consolas" w:cs="Consolas" w:eastAsia="Consolas" w:hAnsi="Consolas"/>
+                <w:sz w:val="17"/>
+                <w:szCs w:val="17"/>
+              </w:rPr>
+              <w:t xml:space="preserve">' OR '1'='1</w:t>
+            </w:r>
             <w:r>
               <w:rPr>
                 <w:rFonts w:ascii="Calibri" w:cs="Calibri" w:eastAsia="Calibri" w:hAnsi="Calibri"/>
                 <w:sz w:val="18"/>
                 <w:szCs w:val="18"/>
               </w:rPr>
-              <w:t xml:space="preserve">Con una referencia como </w:t>
-            </w:r>
-            <w:r>
-              <w:rPr>
-                <w:rFonts w:ascii="Consolas" w:cs="Consolas" w:eastAsia="Consolas" w:hAnsi="Consolas"/>
-                <w:sz w:val="17"/>
-                <w:szCs w:val="17"/>
-              </w:rPr>
-              <w:t xml:space="preserve">' OR '1'='1</w:t>
-            </w:r>
+              <w:t xml:space="preserve"> la consulta devuelve cualquier zapato, y con un nombre malicioso se puede modificar o borrar la tabla de ventas.</w:t>
+            </w:r>
+          </w:p>
+        </w:tc>
+        <w:tc>
+          <w:tcPr>
+            <w:tcW w:type="dxa" w:w="3100"/>
+            <w:tcBorders>
+              <w:top w:val="single" w:color="999999" w:sz="4"/>
+              <w:left w:val="single" w:color="999999" w:sz="4"/>
+              <w:bottom w:val="single" w:color="999999" w:sz="4"/>
+              <w:right w:val="single" w:color="999999" w:sz="4"/>
+            </w:tcBorders>
+            <w:tcMar>
+              <w:top w:type="dxa" w:w="80"/>
+              <w:left w:type="dxa" w:w="100"/>
+              <w:bottom w:type="dxa" w:w="80"/>
+              <w:right w:type="dxa" w:w="100"/>
+            </w:tcMar>
+          </w:tcPr>
+          <w:p>
+            <w:pPr>
+              <w:spacing w:after="0"/>
+            </w:pPr>
             <w:r>
               <w:rPr>
                 <w:rFonts w:ascii="Calibri" w:cs="Calibri" w:eastAsia="Calibri" w:hAnsi="Calibri"/>
                 <w:sz w:val="18"/>
                 <w:szCs w:val="18"/>
               </w:rPr>
-              <w:t xml:space="preserve"> la consulta devuelve cualquier zapato; con un nombre malicioso se puede alterar o borrar la tabla de ventas.</w:t>
-            </w:r>
-          </w:p>
-        </w:tc>
-        <w:tc>
-          <w:tcPr>
-            <w:tcW w:type="dxa" w:w="3100"/>
-            <w:tcBorders>
-              <w:top w:val="single" w:color="999999" w:sz="4"/>
-              <w:left w:val="single" w:color="999999" w:sz="4"/>
-              <w:bottom w:val="single" w:color="999999" w:sz="4"/>
-              <w:right w:val="single" w:color="999999" w:sz="4"/>
-            </w:tcBorders>
-            <w:tcMar>
-              <w:top w:type="dxa" w:w="80"/>
-              <w:left w:type="dxa" w:w="100"/>
-              <w:bottom w:type="dxa" w:w="80"/>
-              <w:right w:type="dxa" w:w="100"/>
-            </w:tcMar>
-          </w:tcPr>
-          <w:p>
-            <w:pPr>
-              <w:spacing w:after="0"/>
-            </w:pPr>
-            <w:r>
-              <w:rPr>
-                <w:rFonts w:ascii="Calibri" w:cs="Calibri" w:eastAsia="Calibri" w:hAnsi="Calibri"/>
-                <w:b/>
-                <w:bCs/>
-                <w:sz w:val="18"/>
-                <w:szCs w:val="18"/>
-              </w:rPr>
-              <w:t xml:space="preserve">Inadvertida e imprudente:</w:t>
-            </w:r>
-            <w:r>
-              <w:rPr>
-                <w:rFonts w:ascii="Calibri" w:cs="Calibri" w:eastAsia="Calibri" w:hAnsi="Calibri"/>
-                <w:sz w:val="18"/>
-                <w:szCs w:val="18"/>
-              </w:rPr>
-              <w:t xml:space="preserve"> concatenar texto del usuario en SQL viola una práctica básica que el equipo no aplicó por desconocimiento.</w:t>
+              <w:t xml:space="preserve">Inadvertida e imprudente. Meter texto del usuario directo en el SQL rompe una práctica básica que el equipo no conocía.</w:t>
             </w:r>
           </w:p>
         </w:tc>
@@ -3386,12 +3366,18 @@
             <w:r>
               <w:rPr>
                 <w:rFonts w:ascii="Calibri" w:cs="Calibri" w:eastAsia="Calibri" w:hAnsi="Calibri"/>
-                <w:b/>
-                <w:bCs/>
                 <w:sz w:val="18"/>
                 <w:szCs w:val="18"/>
               </w:rPr>
-              <w:t xml:space="preserve">Credencial de producción en el código.</w:t>
+              <w:t xml:space="preserve">Credencial de producción en el código: </w:t>
+            </w:r>
+            <w:r>
+              <w:rPr>
+                <w:rFonts w:ascii="Consolas" w:cs="Consolas" w:eastAsia="Consolas" w:hAnsi="Consolas"/>
+                <w:sz w:val="17"/>
+                <w:szCs w:val="17"/>
+              </w:rPr>
+              <w:t xml:space="preserve">api_key = "PROD_SECRET_KEY_EXPOSED_12345"</w:t>
             </w:r>
             <w:r>
               <w:rPr>
@@ -3399,15 +3385,15 @@
                 <w:sz w:val="18"/>
                 <w:szCs w:val="18"/>
               </w:rPr>
-              <w:t xml:space="preserve"> </w:t>
-            </w:r>
-            <w:r>
-              <w:rPr>
-                <w:rFonts w:ascii="Consolas" w:cs="Consolas" w:eastAsia="Consolas" w:hAnsi="Consolas"/>
-                <w:sz w:val="17"/>
-                <w:szCs w:val="17"/>
-              </w:rPr>
-              <w:t xml:space="preserve">api_key = "PROD_SECRET_KEY_EXPOSED_12345"</w:t>
+              <w:t xml:space="preserve">, que además se imprime con </w:t>
+            </w:r>
+            <w:r>
+              <w:rPr>
+                <w:rFonts w:ascii="Consolas" w:cs="Consolas" w:eastAsia="Consolas" w:hAnsi="Consolas"/>
+                <w:sz w:val="17"/>
+                <w:szCs w:val="17"/>
+              </w:rPr>
+              <w:t xml:space="preserve">print</w:t>
             </w:r>
             <w:r>
               <w:rPr>
@@ -3415,29 +3401,43 @@
                 <w:sz w:val="18"/>
                 <w:szCs w:val="18"/>
               </w:rPr>
-              <w:t xml:space="preserve"> y además se imprime con </w:t>
-            </w:r>
-            <w:r>
-              <w:rPr>
-                <w:rFonts w:ascii="Consolas" w:cs="Consolas" w:eastAsia="Consolas" w:hAnsi="Consolas"/>
-                <w:sz w:val="17"/>
-                <w:szCs w:val="17"/>
-              </w:rPr>
-              <w:t xml:space="preserve">print</w:t>
-            </w:r>
+              <w:t xml:space="preserve">.</w:t>
+            </w:r>
+          </w:p>
+        </w:tc>
+        <w:tc>
+          <w:tcPr>
+            <w:tcW w:type="dxa" w:w="3500"/>
+            <w:tcBorders>
+              <w:top w:val="single" w:color="999999" w:sz="4"/>
+              <w:left w:val="single" w:color="999999" w:sz="4"/>
+              <w:bottom w:val="single" w:color="999999" w:sz="4"/>
+              <w:right w:val="single" w:color="999999" w:sz="4"/>
+            </w:tcBorders>
+            <w:tcMar>
+              <w:top w:type="dxa" w:w="80"/>
+              <w:left w:type="dxa" w:w="100"/>
+              <w:bottom w:type="dxa" w:w="80"/>
+              <w:right w:type="dxa" w:w="100"/>
+            </w:tcMar>
+          </w:tcPr>
+          <w:p>
+            <w:pPr>
+              <w:spacing w:after="0"/>
+            </w:pPr>
             <w:r>
               <w:rPr>
                 <w:rFonts w:ascii="Calibri" w:cs="Calibri" w:eastAsia="Calibri" w:hAnsi="Calibri"/>
                 <w:sz w:val="18"/>
                 <w:szCs w:val="18"/>
               </w:rPr>
-              <w:t xml:space="preserve">.</w:t>
-            </w:r>
-          </w:p>
-        </w:tc>
-        <w:tc>
-          <w:tcPr>
-            <w:tcW w:type="dxa" w:w="3500"/>
+              <w:t xml:space="preserve">La clave queda en el historial de Git y en los registros del servidor. Cualquiera con acceso al repositorio podría hacer cobros a nombre del negocio.</w:t>
+            </w:r>
+          </w:p>
+        </w:tc>
+        <w:tc>
+          <w:tcPr>
+            <w:tcW w:type="dxa" w:w="3100"/>
             <w:tcBorders>
               <w:top w:val="single" w:color="999999" w:sz="4"/>
               <w:left w:val="single" w:color="999999" w:sz="4"/>
@@ -3461,63 +3461,23 @@
                 <w:sz w:val="18"/>
                 <w:szCs w:val="18"/>
               </w:rPr>
-              <w:t xml:space="preserve">La clave queda en el historial de Git y en los registros del servidor; quien tenga acceso al repositorio puede cobrar a nombre del negocio.</w:t>
-            </w:r>
-          </w:p>
-        </w:tc>
-        <w:tc>
-          <w:tcPr>
-            <w:tcW w:type="dxa" w:w="3100"/>
-            <w:tcBorders>
-              <w:top w:val="single" w:color="999999" w:sz="4"/>
-              <w:left w:val="single" w:color="999999" w:sz="4"/>
-              <w:bottom w:val="single" w:color="999999" w:sz="4"/>
-              <w:right w:val="single" w:color="999999" w:sz="4"/>
-            </w:tcBorders>
-            <w:tcMar>
-              <w:top w:type="dxa" w:w="80"/>
-              <w:left w:type="dxa" w:w="100"/>
-              <w:bottom w:type="dxa" w:w="80"/>
-              <w:right w:type="dxa" w:w="100"/>
-            </w:tcMar>
-          </w:tcPr>
-          <w:p>
-            <w:pPr>
-              <w:spacing w:after="0"/>
-            </w:pPr>
-            <w:r>
-              <w:rPr>
-                <w:rFonts w:ascii="Calibri" w:cs="Calibri" w:eastAsia="Calibri" w:hAnsi="Calibri"/>
-                <w:b/>
-                <w:bCs/>
+              <w:t xml:space="preserve">Deliberada e imprudente. El nombre </w:t>
+            </w:r>
+            <w:r>
+              <w:rPr>
+                <w:rFonts w:ascii="Consolas" w:cs="Consolas" w:eastAsia="Consolas" w:hAnsi="Consolas"/>
+                <w:sz w:val="17"/>
+                <w:szCs w:val="17"/>
+              </w:rPr>
+              <w:t xml:space="preserve">PROD_SECRET</w:t>
+            </w:r>
+            <w:r>
+              <w:rPr>
+                <w:rFonts w:ascii="Calibri" w:cs="Calibri" w:eastAsia="Calibri" w:hAnsi="Calibri"/>
                 <w:sz w:val="18"/>
                 <w:szCs w:val="18"/>
               </w:rPr>
-              <w:t xml:space="preserve">Deliberada e imprudente:</w:t>
-            </w:r>
-            <w:r>
-              <w:rPr>
-                <w:rFonts w:ascii="Calibri" w:cs="Calibri" w:eastAsia="Calibri" w:hAnsi="Calibri"/>
-                <w:sz w:val="18"/>
-                <w:szCs w:val="18"/>
-              </w:rPr>
-              <w:t xml:space="preserve"> el nombre </w:t>
-            </w:r>
-            <w:r>
-              <w:rPr>
-                <w:rFonts w:ascii="Consolas" w:cs="Consolas" w:eastAsia="Consolas" w:hAnsi="Consolas"/>
-                <w:sz w:val="17"/>
-                <w:szCs w:val="17"/>
-              </w:rPr>
-              <w:t xml:space="preserve">PROD_SECRET</w:t>
-            </w:r>
-            <w:r>
-              <w:rPr>
-                <w:rFonts w:ascii="Calibri" w:cs="Calibri" w:eastAsia="Calibri" w:hAnsi="Calibri"/>
-                <w:sz w:val="18"/>
-                <w:szCs w:val="18"/>
-              </w:rPr>
-              <w:t xml:space="preserve"> muestra que se sabía que era un secreto de producción y aun así se dejó, sin registrarlo ni planear su retiro.</w:t>
+              <w:t xml:space="preserve"> deja claro que sabían que era un secreto de producción, y aun así lo dejaron sin registrarlo ni planear quitarlo.</w:t>
             </w:r>
           </w:p>
         </w:tc>
@@ -3579,12 +3539,18 @@
             <w:r>
               <w:rPr>
                 <w:rFonts w:ascii="Calibri" w:cs="Calibri" w:eastAsia="Calibri" w:hAnsi="Calibri"/>
-                <w:b/>
-                <w:bCs/>
                 <w:sz w:val="18"/>
                 <w:szCs w:val="18"/>
               </w:rPr>
-              <w:t xml:space="preserve">Regla fiscal en duro.</w:t>
+              <w:t xml:space="preserve">Regla fiscal fija: </w:t>
+            </w:r>
+            <w:r>
+              <w:rPr>
+                <w:rFonts w:ascii="Consolas" w:cs="Consolas" w:eastAsia="Consolas" w:hAnsi="Consolas"/>
+                <w:sz w:val="17"/>
+                <w:szCs w:val="17"/>
+              </w:rPr>
+              <w:t xml:space="preserve">iva = 0.19</w:t>
             </w:r>
             <w:r>
               <w:rPr>
@@ -3592,15 +3558,15 @@
                 <w:sz w:val="18"/>
                 <w:szCs w:val="18"/>
               </w:rPr>
-              <w:t xml:space="preserve"> </w:t>
-            </w:r>
-            <w:r>
-              <w:rPr>
-                <w:rFonts w:ascii="Consolas" w:cs="Consolas" w:eastAsia="Consolas" w:hAnsi="Consolas"/>
-                <w:sz w:val="17"/>
-                <w:szCs w:val="17"/>
-              </w:rPr>
-              <w:t xml:space="preserve">iva = 0.19</w:t>
+              <w:t xml:space="preserve"> dentro del método de venta, calculado con </w:t>
+            </w:r>
+            <w:r>
+              <w:rPr>
+                <w:rFonts w:ascii="Consolas" w:cs="Consolas" w:eastAsia="Consolas" w:hAnsi="Consolas"/>
+                <w:sz w:val="17"/>
+                <w:szCs w:val="17"/>
+              </w:rPr>
+              <w:t xml:space="preserve">float</w:t>
             </w:r>
             <w:r>
               <w:rPr>
@@ -3608,109 +3574,83 @@
                 <w:sz w:val="18"/>
                 <w:szCs w:val="18"/>
               </w:rPr>
-              <w:t xml:space="preserve"> dentro del método de venta, calculado con </w:t>
-            </w:r>
-            <w:r>
-              <w:rPr>
-                <w:rFonts w:ascii="Consolas" w:cs="Consolas" w:eastAsia="Consolas" w:hAnsi="Consolas"/>
-                <w:sz w:val="17"/>
-                <w:szCs w:val="17"/>
-              </w:rPr>
-              <w:t xml:space="preserve">float</w:t>
-            </w:r>
+              <w:t xml:space="preserve">.</w:t>
+            </w:r>
+          </w:p>
+        </w:tc>
+        <w:tc>
+          <w:tcPr>
+            <w:tcW w:type="dxa" w:w="3500"/>
+            <w:tcBorders>
+              <w:top w:val="single" w:color="999999" w:sz="4"/>
+              <w:left w:val="single" w:color="999999" w:sz="4"/>
+              <w:bottom w:val="single" w:color="999999" w:sz="4"/>
+              <w:right w:val="single" w:color="999999" w:sz="4"/>
+            </w:tcBorders>
+            <w:tcMar>
+              <w:top w:type="dxa" w:w="80"/>
+              <w:left w:type="dxa" w:w="100"/>
+              <w:bottom w:type="dxa" w:w="80"/>
+              <w:right w:type="dxa" w:w="100"/>
+            </w:tcMar>
+          </w:tcPr>
+          <w:p>
+            <w:pPr>
+              <w:spacing w:after="0"/>
+            </w:pPr>
             <w:r>
               <w:rPr>
                 <w:rFonts w:ascii="Calibri" w:cs="Calibri" w:eastAsia="Calibri" w:hAnsi="Calibri"/>
                 <w:sz w:val="18"/>
                 <w:szCs w:val="18"/>
               </w:rPr>
-              <w:t xml:space="preserve">.</w:t>
-            </w:r>
-          </w:p>
-        </w:tc>
-        <w:tc>
-          <w:tcPr>
-            <w:tcW w:type="dxa" w:w="3500"/>
-            <w:tcBorders>
-              <w:top w:val="single" w:color="999999" w:sz="4"/>
-              <w:left w:val="single" w:color="999999" w:sz="4"/>
-              <w:bottom w:val="single" w:color="999999" w:sz="4"/>
-              <w:right w:val="single" w:color="999999" w:sz="4"/>
-            </w:tcBorders>
-            <w:tcMar>
-              <w:top w:type="dxa" w:w="80"/>
-              <w:left w:type="dxa" w:w="100"/>
-              <w:bottom w:type="dxa" w:w="80"/>
-              <w:right w:type="dxa" w:w="100"/>
-            </w:tcMar>
-          </w:tcPr>
-          <w:p>
-            <w:pPr>
-              <w:spacing w:after="0"/>
-            </w:pPr>
+              <w:t xml:space="preserve">Si la tarifa cambia o un producto está excluido, toca modificar el código de ventas. Y el </w:t>
+            </w:r>
+            <w:r>
+              <w:rPr>
+                <w:rFonts w:ascii="Consolas" w:cs="Consolas" w:eastAsia="Consolas" w:hAnsi="Consolas"/>
+                <w:sz w:val="17"/>
+                <w:szCs w:val="17"/>
+              </w:rPr>
+              <w:t xml:space="preserve">float</w:t>
+            </w:r>
             <w:r>
               <w:rPr>
                 <w:rFonts w:ascii="Calibri" w:cs="Calibri" w:eastAsia="Calibri" w:hAnsi="Calibri"/>
                 <w:sz w:val="18"/>
                 <w:szCs w:val="18"/>
               </w:rPr>
-              <w:t xml:space="preserve">Si la tarifa cambia o un producto está excluido, hay que modificar el código de ventas. El </w:t>
-            </w:r>
-            <w:r>
-              <w:rPr>
-                <w:rFonts w:ascii="Consolas" w:cs="Consolas" w:eastAsia="Consolas" w:hAnsi="Consolas"/>
-                <w:sz w:val="17"/>
-                <w:szCs w:val="17"/>
-              </w:rPr>
-              <w:t xml:space="preserve">float</w:t>
-            </w:r>
+              <w:t xml:space="preserve"> acumula errores de redondeo cuando se trabaja con dinero.</w:t>
+            </w:r>
+          </w:p>
+        </w:tc>
+        <w:tc>
+          <w:tcPr>
+            <w:tcW w:type="dxa" w:w="3100"/>
+            <w:tcBorders>
+              <w:top w:val="single" w:color="999999" w:sz="4"/>
+              <w:left w:val="single" w:color="999999" w:sz="4"/>
+              <w:bottom w:val="single" w:color="999999" w:sz="4"/>
+              <w:right w:val="single" w:color="999999" w:sz="4"/>
+            </w:tcBorders>
+            <w:tcMar>
+              <w:top w:type="dxa" w:w="80"/>
+              <w:left w:type="dxa" w:w="100"/>
+              <w:bottom w:type="dxa" w:w="80"/>
+              <w:right w:type="dxa" w:w="100"/>
+            </w:tcMar>
+          </w:tcPr>
+          <w:p>
+            <w:pPr>
+              <w:spacing w:after="0"/>
+            </w:pPr>
             <w:r>
               <w:rPr>
                 <w:rFonts w:ascii="Calibri" w:cs="Calibri" w:eastAsia="Calibri" w:hAnsi="Calibri"/>
                 <w:sz w:val="18"/>
                 <w:szCs w:val="18"/>
               </w:rPr>
-              <w:t xml:space="preserve"> acumula errores de redondeo en dinero.</w:t>
-            </w:r>
-          </w:p>
-        </w:tc>
-        <w:tc>
-          <w:tcPr>
-            <w:tcW w:type="dxa" w:w="3100"/>
-            <w:tcBorders>
-              <w:top w:val="single" w:color="999999" w:sz="4"/>
-              <w:left w:val="single" w:color="999999" w:sz="4"/>
-              <w:bottom w:val="single" w:color="999999" w:sz="4"/>
-              <w:right w:val="single" w:color="999999" w:sz="4"/>
-            </w:tcBorders>
-            <w:tcMar>
-              <w:top w:type="dxa" w:w="80"/>
-              <w:left w:type="dxa" w:w="100"/>
-              <w:bottom w:type="dxa" w:w="80"/>
-              <w:right w:type="dxa" w:w="100"/>
-            </w:tcMar>
-          </w:tcPr>
-          <w:p>
-            <w:pPr>
-              <w:spacing w:after="0"/>
-            </w:pPr>
-            <w:r>
-              <w:rPr>
-                <w:rFonts w:ascii="Calibri" w:cs="Calibri" w:eastAsia="Calibri" w:hAnsi="Calibri"/>
-                <w:b/>
-                <w:bCs/>
-                <w:sz w:val="18"/>
-                <w:szCs w:val="18"/>
-              </w:rPr>
-              <w:t xml:space="preserve">Inadvertida e imprudente:</w:t>
-            </w:r>
-            <w:r>
-              <w:rPr>
-                <w:rFonts w:ascii="Calibri" w:cs="Calibri" w:eastAsia="Calibri" w:hAnsi="Calibri"/>
-                <w:sz w:val="18"/>
-                <w:szCs w:val="18"/>
-              </w:rPr>
-              <w:t xml:space="preserve"> mezclar una regla que cambia por ley con el cálculo de la venta muestra desconocimiento de la separación de responsabilidades.</w:t>
+              <w:t xml:space="preserve">Inadvertida e imprudente. Poner una regla que cambia por ley dentro del cálculo de la venta muestra que no se separaron las responsabilidades.</w:t>
             </w:r>
           </w:p>
         </w:tc>
@@ -3772,12 +3712,18 @@
             <w:r>
               <w:rPr>
                 <w:rFonts w:ascii="Calibri" w:cs="Calibri" w:eastAsia="Calibri" w:hAnsi="Calibri"/>
-                <w:b/>
-                <w:bCs/>
                 <w:sz w:val="18"/>
                 <w:szCs w:val="18"/>
               </w:rPr>
-              <w:t xml:space="preserve">Acoplamiento por variable global.</w:t>
+              <w:t xml:space="preserve">Acoplamiento por variable global: </w:t>
+            </w:r>
+            <w:r>
+              <w:rPr>
+                <w:rFonts w:ascii="Consolas" w:cs="Consolas" w:eastAsia="Consolas" w:hAnsi="Consolas"/>
+                <w:sz w:val="17"/>
+                <w:szCs w:val="17"/>
+              </w:rPr>
+              <w:t xml:space="preserve">CONEXION_GLOBAL</w:t>
             </w:r>
             <w:r>
               <w:rPr>
@@ -3785,15 +3731,15 @@
                 <w:sz w:val="18"/>
                 <w:szCs w:val="18"/>
               </w:rPr>
-              <w:t xml:space="preserve"> </w:t>
-            </w:r>
-            <w:r>
-              <w:rPr>
-                <w:rFonts w:ascii="Consolas" w:cs="Consolas" w:eastAsia="Consolas" w:hAnsi="Consolas"/>
-                <w:sz w:val="17"/>
-                <w:szCs w:val="17"/>
-              </w:rPr>
-              <w:t xml:space="preserve">CONEXION_GLOBAL</w:t>
+              <w:t xml:space="preserve"> se usa con </w:t>
+            </w:r>
+            <w:r>
+              <w:rPr>
+                <w:rFonts w:ascii="Consolas" w:cs="Consolas" w:eastAsia="Consolas" w:hAnsi="Consolas"/>
+                <w:sz w:val="17"/>
+                <w:szCs w:val="17"/>
+              </w:rPr>
+              <w:t xml:space="preserve">global</w:t>
             </w:r>
             <w:r>
               <w:rPr>
@@ -3801,15 +3747,15 @@
                 <w:sz w:val="18"/>
                 <w:szCs w:val="18"/>
               </w:rPr>
-              <w:t xml:space="preserve"> se usa con </w:t>
-            </w:r>
-            <w:r>
-              <w:rPr>
-                <w:rFonts w:ascii="Consolas" w:cs="Consolas" w:eastAsia="Consolas" w:hAnsi="Consolas"/>
-                <w:sz w:val="17"/>
-                <w:szCs w:val="17"/>
-              </w:rPr>
-              <w:t xml:space="preserve">global</w:t>
+              <w:t xml:space="preserve"> y empieza en </w:t>
+            </w:r>
+            <w:r>
+              <w:rPr>
+                <w:rFonts w:ascii="Consolas" w:cs="Consolas" w:eastAsia="Consolas" w:hAnsi="Consolas"/>
+                <w:sz w:val="17"/>
+                <w:szCs w:val="17"/>
+              </w:rPr>
+              <w:t xml:space="preserve">None</w:t>
             </w:r>
             <w:r>
               <w:rPr>
@@ -3817,61 +3763,61 @@
                 <w:sz w:val="18"/>
                 <w:szCs w:val="18"/>
               </w:rPr>
-              <w:t xml:space="preserve"> y empieza en </w:t>
-            </w:r>
-            <w:r>
-              <w:rPr>
-                <w:rFonts w:ascii="Consolas" w:cs="Consolas" w:eastAsia="Consolas" w:hAnsi="Consolas"/>
-                <w:sz w:val="17"/>
-                <w:szCs w:val="17"/>
-              </w:rPr>
-              <w:t xml:space="preserve">None</w:t>
-            </w:r>
+              <w:t xml:space="preserve">.</w:t>
+            </w:r>
+          </w:p>
+        </w:tc>
+        <w:tc>
+          <w:tcPr>
+            <w:tcW w:type="dxa" w:w="3500"/>
+            <w:tcBorders>
+              <w:top w:val="single" w:color="999999" w:sz="4"/>
+              <w:left w:val="single" w:color="999999" w:sz="4"/>
+              <w:bottom w:val="single" w:color="999999" w:sz="4"/>
+              <w:right w:val="single" w:color="999999" w:sz="4"/>
+            </w:tcBorders>
+            <w:tcMar>
+              <w:top w:type="dxa" w:w="80"/>
+              <w:left w:type="dxa" w:w="100"/>
+              <w:bottom w:type="dxa" w:w="80"/>
+              <w:right w:type="dxa" w:w="100"/>
+            </w:tcMar>
+          </w:tcPr>
+          <w:p>
+            <w:pPr>
+              <w:spacing w:after="0"/>
+            </w:pPr>
             <w:r>
               <w:rPr>
                 <w:rFonts w:ascii="Calibri" w:cs="Calibri" w:eastAsia="Calibri" w:hAnsi="Calibri"/>
                 <w:sz w:val="18"/>
                 <w:szCs w:val="18"/>
               </w:rPr>
-              <w:t xml:space="preserve">.</w:t>
-            </w:r>
-          </w:p>
-        </w:tc>
-        <w:tc>
-          <w:tcPr>
-            <w:tcW w:type="dxa" w:w="3500"/>
-            <w:tcBorders>
-              <w:top w:val="single" w:color="999999" w:sz="4"/>
-              <w:left w:val="single" w:color="999999" w:sz="4"/>
-              <w:bottom w:val="single" w:color="999999" w:sz="4"/>
-              <w:right w:val="single" w:color="999999" w:sz="4"/>
-            </w:tcBorders>
-            <w:tcMar>
-              <w:top w:type="dxa" w:w="80"/>
-              <w:left w:type="dxa" w:w="100"/>
-              <w:bottom w:type="dxa" w:w="80"/>
-              <w:right w:type="dxa" w:w="100"/>
-            </w:tcMar>
-          </w:tcPr>
-          <w:p>
-            <w:pPr>
-              <w:spacing w:after="0"/>
-            </w:pPr>
+              <w:t xml:space="preserve">Si nadie la inicializa, la venta falla con </w:t>
+            </w:r>
+            <w:r>
+              <w:rPr>
+                <w:rFonts w:ascii="Consolas" w:cs="Consolas" w:eastAsia="Consolas" w:hAnsi="Consolas"/>
+                <w:sz w:val="17"/>
+                <w:szCs w:val="17"/>
+              </w:rPr>
+              <w:t xml:space="preserve">AttributeError</w:t>
+            </w:r>
             <w:r>
               <w:rPr>
                 <w:rFonts w:ascii="Calibri" w:cs="Calibri" w:eastAsia="Calibri" w:hAnsi="Calibri"/>
                 <w:sz w:val="18"/>
                 <w:szCs w:val="18"/>
               </w:rPr>
-              <w:t xml:space="preserve">Si nadie la inicializa, la venta falla con </w:t>
-            </w:r>
-            <w:r>
-              <w:rPr>
-                <w:rFonts w:ascii="Consolas" w:cs="Consolas" w:eastAsia="Consolas" w:hAnsi="Consolas"/>
-                <w:sz w:val="17"/>
-                <w:szCs w:val="17"/>
-              </w:rPr>
-              <w:t xml:space="preserve">AttributeError</w:t>
+              <w:t xml:space="preserve">. Tampoco se puede cambiar por una base de pruebas, y no hay transacción ni </w:t>
+            </w:r>
+            <w:r>
+              <w:rPr>
+                <w:rFonts w:ascii="Consolas" w:cs="Consolas" w:eastAsia="Consolas" w:hAnsi="Consolas"/>
+                <w:sz w:val="17"/>
+                <w:szCs w:val="17"/>
+              </w:rPr>
+              <w:t xml:space="preserve">commit</w:t>
             </w:r>
             <w:r>
               <w:rPr>
@@ -3879,63 +3825,37 @@
                 <w:sz w:val="18"/>
                 <w:szCs w:val="18"/>
               </w:rPr>
-              <w:t xml:space="preserve">. No se puede sustituir por una base de pruebas y no hay transacción ni </w:t>
-            </w:r>
-            <w:r>
-              <w:rPr>
-                <w:rFonts w:ascii="Consolas" w:cs="Consolas" w:eastAsia="Consolas" w:hAnsi="Consolas"/>
-                <w:sz w:val="17"/>
-                <w:szCs w:val="17"/>
-              </w:rPr>
-              <w:t xml:space="preserve">commit</w:t>
-            </w:r>
+              <w:t xml:space="preserve">.</w:t>
+            </w:r>
+          </w:p>
+        </w:tc>
+        <w:tc>
+          <w:tcPr>
+            <w:tcW w:type="dxa" w:w="3100"/>
+            <w:tcBorders>
+              <w:top w:val="single" w:color="999999" w:sz="4"/>
+              <w:left w:val="single" w:color="999999" w:sz="4"/>
+              <w:bottom w:val="single" w:color="999999" w:sz="4"/>
+              <w:right w:val="single" w:color="999999" w:sz="4"/>
+            </w:tcBorders>
+            <w:tcMar>
+              <w:top w:type="dxa" w:w="80"/>
+              <w:left w:type="dxa" w:w="100"/>
+              <w:bottom w:type="dxa" w:w="80"/>
+              <w:right w:type="dxa" w:w="100"/>
+            </w:tcMar>
+          </w:tcPr>
+          <w:p>
+            <w:pPr>
+              <w:spacing w:after="0"/>
+            </w:pPr>
             <w:r>
               <w:rPr>
                 <w:rFonts w:ascii="Calibri" w:cs="Calibri" w:eastAsia="Calibri" w:hAnsi="Calibri"/>
                 <w:sz w:val="18"/>
                 <w:szCs w:val="18"/>
               </w:rPr>
-              <w:t xml:space="preserve">.</w:t>
-            </w:r>
-          </w:p>
-        </w:tc>
-        <w:tc>
-          <w:tcPr>
-            <w:tcW w:type="dxa" w:w="3100"/>
-            <w:tcBorders>
-              <w:top w:val="single" w:color="999999" w:sz="4"/>
-              <w:left w:val="single" w:color="999999" w:sz="4"/>
-              <w:bottom w:val="single" w:color="999999" w:sz="4"/>
-              <w:right w:val="single" w:color="999999" w:sz="4"/>
-            </w:tcBorders>
-            <w:tcMar>
-              <w:top w:type="dxa" w:w="80"/>
-              <w:left w:type="dxa" w:w="100"/>
-              <w:bottom w:type="dxa" w:w="80"/>
-              <w:right w:type="dxa" w:w="100"/>
-            </w:tcMar>
-          </w:tcPr>
-          <w:p>
-            <w:pPr>
-              <w:spacing w:after="0"/>
-            </w:pPr>
-            <w:r>
-              <w:rPr>
-                <w:rFonts w:ascii="Calibri" w:cs="Calibri" w:eastAsia="Calibri" w:hAnsi="Calibri"/>
-                <w:b/>
-                <w:bCs/>
-                <w:sz w:val="18"/>
-                <w:szCs w:val="18"/>
-              </w:rPr>
-              <w:t xml:space="preserve">Inadvertida e imprudente:</w:t>
-            </w:r>
-            <w:r>
-              <w:rPr>
-                <w:rFonts w:ascii="Calibri" w:cs="Calibri" w:eastAsia="Calibri" w:hAnsi="Calibri"/>
-                <w:sz w:val="18"/>
-                <w:szCs w:val="18"/>
-              </w:rPr>
-              <w:t xml:space="preserve"> impide probar el método de forma aislada, que es el requisito para refactorizar con seguridad.</w:t>
+              <w:t xml:space="preserve">Inadvertida e imprudente. No deja probar el método aislado, y sin eso no se puede refactorizar con seguridad.</w:t>
             </w:r>
           </w:p>
         </w:tc>
@@ -3997,12 +3917,18 @@
             <w:r>
               <w:rPr>
                 <w:rFonts w:ascii="Calibri" w:cs="Calibri" w:eastAsia="Calibri" w:hAnsi="Calibri"/>
-                <w:b/>
-                <w:bCs/>
                 <w:sz w:val="18"/>
                 <w:szCs w:val="18"/>
               </w:rPr>
-              <w:t xml:space="preserve">Validaciones ausentes y datos personales repetidos.</w:t>
+              <w:t xml:space="preserve">Faltan validaciones y se repiten datos personales. No revisa si el zapato existe (</w:t>
+            </w:r>
+            <w:r>
+              <w:rPr>
+                <w:rFonts w:ascii="Consolas" w:cs="Consolas" w:eastAsia="Consolas" w:hAnsi="Consolas"/>
+                <w:sz w:val="17"/>
+                <w:szCs w:val="17"/>
+              </w:rPr>
+              <w:t xml:space="preserve">fetchone()</w:t>
             </w:r>
             <w:r>
               <w:rPr>
@@ -4010,15 +3936,15 @@
                 <w:sz w:val="18"/>
                 <w:szCs w:val="18"/>
               </w:rPr>
-              <w:t xml:space="preserve"> No revisa si el zapato existe (</w:t>
-            </w:r>
-            <w:r>
-              <w:rPr>
-                <w:rFonts w:ascii="Consolas" w:cs="Consolas" w:eastAsia="Consolas" w:hAnsi="Consolas"/>
-                <w:sz w:val="17"/>
-                <w:szCs w:val="17"/>
-              </w:rPr>
-              <w:t xml:space="preserve">fetchone()</w:t>
+              <w:t xml:space="preserve"> puede devolver </w:t>
+            </w:r>
+            <w:r>
+              <w:rPr>
+                <w:rFonts w:ascii="Consolas" w:cs="Consolas" w:eastAsia="Consolas" w:hAnsi="Consolas"/>
+                <w:sz w:val="17"/>
+                <w:szCs w:val="17"/>
+              </w:rPr>
+              <w:t xml:space="preserve">None</w:t>
             </w:r>
             <w:r>
               <w:rPr>
@@ -4026,29 +3952,43 @@
                 <w:sz w:val="18"/>
                 <w:szCs w:val="18"/>
               </w:rPr>
-              <w:t xml:space="preserve"> puede ser </w:t>
-            </w:r>
-            <w:r>
-              <w:rPr>
-                <w:rFonts w:ascii="Consolas" w:cs="Consolas" w:eastAsia="Consolas" w:hAnsi="Consolas"/>
-                <w:sz w:val="17"/>
-                <w:szCs w:val="17"/>
-              </w:rPr>
-              <w:t xml:space="preserve">None</w:t>
-            </w:r>
+              <w:t xml:space="preserve">) ni si hay stock, y guarda nombre y cédula en cada venta.</w:t>
+            </w:r>
+          </w:p>
+        </w:tc>
+        <w:tc>
+          <w:tcPr>
+            <w:tcW w:type="dxa" w:w="3500"/>
+            <w:tcBorders>
+              <w:top w:val="single" w:color="999999" w:sz="4"/>
+              <w:left w:val="single" w:color="999999" w:sz="4"/>
+              <w:bottom w:val="single" w:color="999999" w:sz="4"/>
+              <w:right w:val="single" w:color="999999" w:sz="4"/>
+            </w:tcBorders>
+            <w:tcMar>
+              <w:top w:type="dxa" w:w="80"/>
+              <w:left w:type="dxa" w:w="100"/>
+              <w:bottom w:type="dxa" w:w="80"/>
+              <w:right w:type="dxa" w:w="100"/>
+            </w:tcMar>
+          </w:tcPr>
+          <w:p>
+            <w:pPr>
+              <w:spacing w:after="0"/>
+            </w:pPr>
             <w:r>
               <w:rPr>
                 <w:rFonts w:ascii="Calibri" w:cs="Calibri" w:eastAsia="Calibri" w:hAnsi="Calibri"/>
                 <w:sz w:val="18"/>
                 <w:szCs w:val="18"/>
               </w:rPr>
-              <w:t xml:space="preserve">) ni si hay stock; guarda nombre y cédula en cada venta.</w:t>
-            </w:r>
-          </w:p>
-        </w:tc>
-        <w:tc>
-          <w:tcPr>
-            <w:tcW w:type="dxa" w:w="3500"/>
+              <w:t xml:space="preserve">Puede quedar stock negativo, una referencia mal digitada produce un error técnico y los datos personales se copian en cada fila, contra el principio de minimización de la Ley 1581 de 2012.</w:t>
+            </w:r>
+          </w:p>
+        </w:tc>
+        <w:tc>
+          <w:tcPr>
+            <w:tcW w:type="dxa" w:w="3100"/>
             <w:tcBorders>
               <w:top w:val="single" w:color="999999" w:sz="4"/>
               <w:left w:val="single" w:color="999999" w:sz="4"/>
@@ -4072,47 +4012,7 @@
                 <w:sz w:val="18"/>
                 <w:szCs w:val="18"/>
               </w:rPr>
-              <w:t xml:space="preserve">Ventas con stock negativo, errores técnicos ante una referencia mal digitada y datos personales copiados en cada fila, contra el principio de minimización de la Ley 1581 de 2012.</w:t>
-            </w:r>
-          </w:p>
-        </w:tc>
-        <w:tc>
-          <w:tcPr>
-            <w:tcW w:type="dxa" w:w="3100"/>
-            <w:tcBorders>
-              <w:top w:val="single" w:color="999999" w:sz="4"/>
-              <w:left w:val="single" w:color="999999" w:sz="4"/>
-              <w:bottom w:val="single" w:color="999999" w:sz="4"/>
-              <w:right w:val="single" w:color="999999" w:sz="4"/>
-            </w:tcBorders>
-            <w:tcMar>
-              <w:top w:type="dxa" w:w="80"/>
-              <w:left w:type="dxa" w:w="100"/>
-              <w:bottom w:type="dxa" w:w="80"/>
-              <w:right w:type="dxa" w:w="100"/>
-            </w:tcMar>
-          </w:tcPr>
-          <w:p>
-            <w:pPr>
-              <w:spacing w:after="0"/>
-            </w:pPr>
-            <w:r>
-              <w:rPr>
-                <w:rFonts w:ascii="Calibri" w:cs="Calibri" w:eastAsia="Calibri" w:hAnsi="Calibri"/>
-                <w:b/>
-                <w:bCs/>
-                <w:sz w:val="18"/>
-                <w:szCs w:val="18"/>
-              </w:rPr>
-              <w:t xml:space="preserve">Inadvertida e imprudente:</w:t>
-            </w:r>
-            <w:r>
-              <w:rPr>
-                <w:rFonts w:ascii="Calibri" w:cs="Calibri" w:eastAsia="Calibri" w:hAnsi="Calibri"/>
-                <w:sz w:val="18"/>
-                <w:szCs w:val="18"/>
-              </w:rPr>
-              <w:t xml:space="preserve"> son omisiones de diseño, no atajos conscientes.</w:t>
+              <w:t xml:space="preserve">Inadvertida e imprudente. Son cosas que se olvidaron al diseñar, no atajos que alguien tomara a propósito.</w:t>
             </w:r>
           </w:p>
         </w:tc>
@@ -4175,21 +4075,7 @@
         <w:rPr>
           <w:rFonts w:ascii="Calibri" w:cs="Calibri" w:eastAsia="Calibri" w:hAnsi="Calibri"/>
         </w:rPr>
-        <w:t xml:space="preserve">El método tiene </w:t>
-      </w:r>
-      <w:r>
-        <w:rPr>
-          <w:rFonts w:ascii="Calibri" w:cs="Calibri" w:eastAsia="Calibri" w:hAnsi="Calibri"/>
-          <w:b/>
-          <w:bCs/>
-        </w:rPr>
-        <w:t xml:space="preserve">una sola decisión</w:t>
-      </w:r>
-      <w:r>
-        <w:rPr>
-          <w:rFonts w:ascii="Calibri" w:cs="Calibri" w:eastAsia="Calibri" w:hAnsi="Calibri"/>
-        </w:rPr>
-        <w:t xml:space="preserve">: </w:t>
+        <w:t xml:space="preserve">El método tiene una sola decisión, </w:t>
       </w:r>
       <w:r>
         <w:rPr>
@@ -4203,21 +4089,7 @@
         <w:rPr>
           <w:rFonts w:ascii="Calibri" w:cs="Calibri" w:eastAsia="Calibri" w:hAnsi="Calibri"/>
         </w:rPr>
-        <w:t xml:space="preserve">. Por lo tanto </w:t>
-      </w:r>
-      <w:r>
-        <w:rPr>
-          <w:rFonts w:ascii="Calibri" w:cs="Calibri" w:eastAsia="Calibri" w:hAnsi="Calibri"/>
-          <w:b/>
-          <w:bCs/>
-        </w:rPr>
-        <w:t xml:space="preserve">V(G) = 1 + 1 = 2</w:t>
-      </w:r>
-      <w:r>
-        <w:rPr>
-          <w:rFonts w:ascii="Calibri" w:cs="Calibri" w:eastAsia="Calibri" w:hAnsi="Calibri"/>
-        </w:rPr>
-        <w:t xml:space="preserve">, que coincide con lo que reporta radon (</w:t>
+        <w:t xml:space="preserve">, así que V(G) = 1 + 1 = 2. radon da el mismo resultado (</w:t>
       </w:r>
       <w:r>
         <w:rPr>
@@ -4242,21 +4114,7 @@
         <w:rPr>
           <w:rFonts w:ascii="Calibri" w:cs="Calibri" w:eastAsia="Calibri" w:hAnsi="Calibri"/>
         </w:rPr>
-        <w:t xml:space="preserve">Se necesitan </w:t>
-      </w:r>
-      <w:r>
-        <w:rPr>
-          <w:rFonts w:ascii="Calibri" w:cs="Calibri" w:eastAsia="Calibri" w:hAnsi="Calibri"/>
-          <w:b/>
-          <w:bCs/>
-        </w:rPr>
-        <w:t xml:space="preserve">mínimo 2 casos de prueba</w:t>
-      </w:r>
-      <w:r>
-        <w:rPr>
-          <w:rFonts w:ascii="Calibri" w:cs="Calibri" w:eastAsia="Calibri" w:hAnsi="Calibri"/>
-        </w:rPr>
-        <w:t xml:space="preserve"> para cubrir sus caminos lógicos:</w:t>
+        <w:t xml:space="preserve">Con 2 casos de prueba se cubren sus caminos lógicos:</w:t>
       </w:r>
     </w:p>
     <w:p>
@@ -4271,16 +4129,8 @@
       <w:r>
         <w:rPr>
           <w:rFonts w:ascii="Calibri" w:cs="Calibri" w:eastAsia="Calibri" w:hAnsi="Calibri"/>
-          <w:b/>
-          <w:bCs/>
-        </w:rPr>
-        <w:t xml:space="preserve">Camino 1:</w:t>
-      </w:r>
-      <w:r>
-        <w:rPr>
-          <w:rFonts w:ascii="Calibri" w:cs="Calibri" w:eastAsia="Calibri" w:hAnsi="Calibri"/>
-        </w:rPr>
-        <w:t xml:space="preserve"> </w:t>
+        </w:rPr>
+        <w:t xml:space="preserve">Camino 1: </w:t>
       </w:r>
       <w:r>
         <w:rPr>
@@ -4294,7 +4144,7 @@
         <w:rPr>
           <w:rFonts w:ascii="Calibri" w:cs="Calibri" w:eastAsia="Calibri" w:hAnsi="Calibri"/>
         </w:rPr>
-        <w:t xml:space="preserve">: registra la venta y entra a la llamada de la pasarela.</w:t>
+        <w:t xml:space="preserve">. Registra la venta y entra a la llamada de la pasarela.</w:t>
       </w:r>
     </w:p>
     <w:p>
@@ -4309,16 +4159,8 @@
       <w:r>
         <w:rPr>
           <w:rFonts w:ascii="Calibri" w:cs="Calibri" w:eastAsia="Calibri" w:hAnsi="Calibri"/>
-          <w:b/>
-          <w:bCs/>
-        </w:rPr>
-        <w:t xml:space="preserve">Camino 2:</w:t>
-      </w:r>
-      <w:r>
-        <w:rPr>
-          <w:rFonts w:ascii="Calibri" w:cs="Calibri" w:eastAsia="Calibri" w:hAnsi="Calibri"/>
-        </w:rPr>
-        <w:t xml:space="preserve"> cualquier otro medio, por ejemplo </w:t>
+        </w:rPr>
+        <w:t xml:space="preserve">Camino 2: cualquier otro medio, por ejemplo </w:t>
       </w:r>
       <w:r>
         <w:rPr>
@@ -4332,7 +4174,7 @@
         <w:rPr>
           <w:rFonts w:ascii="Calibri" w:cs="Calibri" w:eastAsia="Calibri" w:hAnsi="Calibri"/>
         </w:rPr>
-        <w:t xml:space="preserve">: registra la venta y termina sin llamar a la pasarela.</w:t>
+        <w:t xml:space="preserve">. Registra la venta y termina sin llamar a la pasarela.</w:t>
       </w:r>
     </w:p>
     <w:p>
@@ -4343,7 +4185,7 @@
         <w:rPr>
           <w:rFonts w:ascii="Calibri" w:cs="Calibri" w:eastAsia="Calibri" w:hAnsi="Calibri"/>
         </w:rPr>
-        <w:t xml:space="preserve">La conclusión importante es que una complejidad baja no significa código sano. McCabe solo cuenta decisiones explícitas: los caminos de error ocultos (referencia inexistente, conexión sin inicializar, falla de la base de datos) no suman y los dos casos mínimos tampoco detectarían la inyección SQL, que exige probar con entradas maliciosas. La versión corregida del Ejercicio 6 sube a V(G) = 6 porque ahora valida de forma explícita la existencia del producto, el stock y el resultado del cobro; sigue muy por debajo de 10 y cada camino tiene su prueba.</w:t>
+        <w:t xml:space="preserve">Que la complejidad salga tan baja no quiere decir que el código esté bien. McCabe solo cuenta las decisiones que están escritas, y aquí los errores pasan por caminos que no se ven: una referencia que no existe, la conexión sin inicializar o una falla de la base de datos. Además, esos dos casos de prueba no encontrarían la inyección SQL; para eso hay que probar con entradas maliciosas. La versión que corregí en el Ejercicio 6 sube a V(G) = 6 porque ahora valida de forma explícita si el producto existe, si hay stock y si el cobro se aprobó. Sigue lejos de 10, y cada uno de esos caminos tiene su prueba.</w:t>
       </w:r>
     </w:p>
     <w:p>
@@ -4387,7 +4229,7 @@
         <w:rPr>
           <w:rFonts w:ascii="Calibri" w:cs="Calibri" w:eastAsia="Calibri" w:hAnsi="Calibri"/>
         </w:rPr>
-        <w:t xml:space="preserve">Se usó Claude (Anthropic) en una sesión de chat el 30/10/2026. Solo se envió el fragmento ficticio de la guía: ningún dato ni código de FitManage. Todo quedó guardado en el repositorio, en </w:t>
+        <w:t xml:space="preserve">Usé Claude (Anthropic) en una sesión de chat el 30/10/2026. Solo le envié el fragmento ficticio de la guía, sin ningún dato ni código de FitManage. El prompt y la respuesta quedaron guardados en el repositorio, en </w:t>
       </w:r>
       <w:r>
         <w:rPr>
@@ -4440,8 +4282,6 @@
       <w:r>
         <w:rPr>
           <w:rFonts w:ascii="Calibri" w:cs="Calibri" w:eastAsia="Calibri" w:hAnsi="Calibri"/>
-          <w:b/>
-          <w:bCs/>
         </w:rPr>
         <w:t xml:space="preserve">Prompt ingresado:</w:t>
       </w:r>
@@ -4497,7 +4337,7 @@
               <w:rPr>
                 <w:rFonts w:ascii="Calibri" w:cs="Calibri" w:eastAsia="Calibri" w:hAnsi="Calibri"/>
               </w:rPr>
-              <w:t xml:space="preserve">(Se pegó a continuación el fragmento completo del Ejercicio 3.)</w:t>
+              <w:t xml:space="preserve">(A continuación pegué el fragmento completo del Ejercicio 3.)</w:t>
             </w:r>
           </w:p>
         </w:tc>
@@ -4516,8 +4356,6 @@
       <w:r>
         <w:rPr>
           <w:rFonts w:ascii="Calibri" w:cs="Calibri" w:eastAsia="Calibri" w:hAnsi="Calibri"/>
-          <w:b/>
-          <w:bCs/>
         </w:rPr>
         <w:t xml:space="preserve">Respuesta completa de la IA, sin modificar:</w:t>
       </w:r>
@@ -5636,10 +5474,8 @@
       <w:r>
         <w:rPr>
           <w:rFonts w:ascii="Calibri" w:cs="Calibri" w:eastAsia="Calibri" w:hAnsi="Calibri"/>
-          <w:b/>
-          <w:bCs/>
-        </w:rPr>
-        <w:t xml:space="preserve">Explicación que acompañó al código:</w:t>
+        </w:rPr>
+        <w:t xml:space="preserve">Explicación que dio la IA junto con el código:</w:t>
       </w:r>
     </w:p>
     <w:p>
@@ -5848,7 +5684,7 @@
         <w:rPr>
           <w:rFonts w:ascii="Calibri" w:cs="Calibri" w:eastAsia="Calibri" w:hAnsi="Calibri"/>
         </w:rPr>
-        <w:t xml:space="preserve">La auditoría no se hizo solo leyendo: se pasaron ruff, bandit y radon sobre la respuesta y se escribieron 5 pruebas (</w:t>
+        <w:t xml:space="preserve">No me quedé con leer la respuesta. Le pasé ruff, bandit y radon, y escribí 5 pruebas (</w:t>
       </w:r>
       <w:r>
         <w:rPr>
@@ -5862,21 +5698,7 @@
         <w:rPr>
           <w:rFonts w:ascii="Calibri" w:cs="Calibri" w:eastAsia="Calibri" w:hAnsi="Calibri"/>
         </w:rPr>
-        <w:t xml:space="preserve">) que pasan solo si el defecto existe. </w:t>
-      </w:r>
-      <w:r>
-        <w:rPr>
-          <w:rFonts w:ascii="Calibri" w:cs="Calibri" w:eastAsia="Calibri" w:hAnsi="Calibri"/>
-          <w:b/>
-          <w:bCs/>
-        </w:rPr>
-        <w:t xml:space="preserve">Resultado: 5 de 5 defectos confirmados.</w:t>
-      </w:r>
-      <w:r>
-        <w:rPr>
-          <w:rFonts w:ascii="Calibri" w:cs="Calibri" w:eastAsia="Calibri" w:hAnsi="Calibri"/>
-        </w:rPr>
-        <w:t xml:space="preserve"> La conclusión es que la IA resolvió bien el acoplamiento estructural, pero disimuló el problema del secreto y afirmó algo falso al decir que el código quedaba «listo para producción».</w:t>
+        <w:t xml:space="preserve">) que solo pasan si el defecto existe; las 5 pasaron. La IA resolvió bien el acoplamiento: el servicio ahora recibe sus dependencias. Lo del secreto, en cambio, solo lo maquilló, y se equivocó al decir que el código quedaba listo para producción.</w:t>
       </w:r>
     </w:p>
     <w:tbl>
@@ -6023,20 +5845,10 @@
             <w:r>
               <w:rPr>
                 <w:rFonts w:ascii="Calibri" w:cs="Calibri" w:eastAsia="Calibri" w:hAnsi="Calibri"/>
-                <w:b/>
-                <w:bCs/>
-                <w:sz w:val="19"/>
-                <w:szCs w:val="19"/>
-              </w:rPr>
-              <w:t xml:space="preserve">Parcialmente.</w:t>
-            </w:r>
-            <w:r>
-              <w:rPr>
-                <w:rFonts w:ascii="Calibri" w:cs="Calibri" w:eastAsia="Calibri" w:hAnsi="Calibri"/>
-                <w:sz w:val="19"/>
-                <w:szCs w:val="19"/>
-              </w:rPr>
-              <w:t xml:space="preserve"> Corrigió la inyección SQL con consultas parametrizadas y eliminó la variable global inyectando las dependencias por el constructor.</w:t>
+                <w:sz w:val="19"/>
+                <w:szCs w:val="19"/>
+              </w:rPr>
+              <w:t xml:space="preserve">Solo en parte. Corrigió la inyección SQL con consultas parametrizadas y quitó la variable global pasando las dependencias por el constructor.</w:t>
             </w:r>
           </w:p>
           <w:p>
@@ -6046,20 +5858,10 @@
             <w:r>
               <w:rPr>
                 <w:rFonts w:ascii="Calibri" w:cs="Calibri" w:eastAsia="Calibri" w:hAnsi="Calibri"/>
-                <w:b/>
-                <w:bCs/>
-                <w:sz w:val="19"/>
-                <w:szCs w:val="19"/>
-              </w:rPr>
-              <w:t xml:space="preserve">El secreto sigue expuesto:</w:t>
-            </w:r>
-            <w:r>
-              <w:rPr>
-                <w:rFonts w:ascii="Calibri" w:cs="Calibri" w:eastAsia="Calibri" w:hAnsi="Calibri"/>
-                <w:sz w:val="19"/>
-                <w:szCs w:val="19"/>
-              </w:rPr>
-              <w:t xml:space="preserve"> </w:t>
+                <w:sz w:val="19"/>
+                <w:szCs w:val="19"/>
+              </w:rPr>
+              <w:t xml:space="preserve">El secreto sigue en el código. </w:t>
             </w:r>
             <w:r>
               <w:rPr>
@@ -6075,7 +5877,7 @@
                 <w:sz w:val="19"/>
                 <w:szCs w:val="19"/>
               </w:rPr>
-              <w:t xml:space="preserve"> deja la clave como valor por defecto. Si la variable no existe, el sistema usa la clave filtrada sin avisar (prueba </w:t>
+              <w:t xml:space="preserve"> deja la clave como valor por defecto: si la variable de entorno no existe, el sistema usa la clave filtrada sin avisar (lo comprueba la prueba </w:t>
             </w:r>
             <w:r>
               <w:rPr>
@@ -6091,30 +5893,20 @@
                 <w:sz w:val="19"/>
                 <w:szCs w:val="19"/>
               </w:rPr>
-              <w:t xml:space="preserve">). Además la evalúa al importar el módulo (ruff B008).</w:t>
-            </w:r>
-          </w:p>
-          <w:p>
-            <w:pPr>
-              <w:spacing w:after="0"/>
-            </w:pPr>
-            <w:r>
-              <w:rPr>
-                <w:rFonts w:ascii="Calibri" w:cs="Calibri" w:eastAsia="Calibri" w:hAnsi="Calibri"/>
-                <w:b/>
-                <w:bCs/>
-                <w:sz w:val="19"/>
-                <w:szCs w:val="19"/>
-              </w:rPr>
-              <w:t xml:space="preserve">No detectó:</w:t>
-            </w:r>
-            <w:r>
-              <w:rPr>
-                <w:rFonts w:ascii="Calibri" w:cs="Calibri" w:eastAsia="Calibri" w:hAnsi="Calibri"/>
-                <w:sz w:val="19"/>
-                <w:szCs w:val="19"/>
-              </w:rPr>
-              <w:t xml:space="preserve"> la falta de validación de stock, la referencia inexistente, el uso de </w:t>
+              <w:t xml:space="preserve">). Además la lee al importar el módulo (ruff B008).</w:t>
+            </w:r>
+          </w:p>
+          <w:p>
+            <w:pPr>
+              <w:spacing w:after="0"/>
+            </w:pPr>
+            <w:r>
+              <w:rPr>
+                <w:rFonts w:ascii="Calibri" w:cs="Calibri" w:eastAsia="Calibri" w:hAnsi="Calibri"/>
+                <w:sz w:val="19"/>
+                <w:szCs w:val="19"/>
+              </w:rPr>
+              <w:t xml:space="preserve">Hubo varias cosas que no vio: que no valida el stock ni la referencia inexistente, que usa </w:t>
             </w:r>
             <w:r>
               <w:rPr>
@@ -6130,25 +5922,7 @@
                 <w:sz w:val="19"/>
                 <w:szCs w:val="19"/>
               </w:rPr>
-              <w:t xml:space="preserve"> para dinero, que la venta se registra </w:t>
-            </w:r>
-            <w:r>
-              <w:rPr>
-                <w:rFonts w:ascii="Calibri" w:cs="Calibri" w:eastAsia="Calibri" w:hAnsi="Calibri"/>
-                <w:b/>
-                <w:bCs/>
-                <w:sz w:val="19"/>
-                <w:szCs w:val="19"/>
-              </w:rPr>
-              <w:t xml:space="preserve">antes</w:t>
-            </w:r>
-            <w:r>
-              <w:rPr>
-                <w:rFonts w:ascii="Calibri" w:cs="Calibri" w:eastAsia="Calibri" w:hAnsi="Calibri"/>
-                <w:sz w:val="19"/>
-                <w:szCs w:val="19"/>
-              </w:rPr>
-              <w:t xml:space="preserve"> de cobrar y se ignora si el cobro falla, y la llamada HTTP sin tiempo de espera (bandit B113). El IVA solo cambió de lugar: sigue en duro como constante.</w:t>
+              <w:t xml:space="preserve"> para el dinero, que registra la venta antes de cobrar e ignora si el cobro falla, y que la llamada HTTP no tiene tiempo de espera (bandit B113). El IVA solo lo cambió de lugar; sigue fijo, ahora como constante.</w:t>
             </w:r>
           </w:p>
         </w:tc>
@@ -6210,20 +5984,10 @@
             <w:r>
               <w:rPr>
                 <w:rFonts w:ascii="Calibri" w:cs="Calibri" w:eastAsia="Calibri" w:hAnsi="Calibri"/>
-                <w:b/>
-                <w:bCs/>
-                <w:sz w:val="19"/>
-                <w:szCs w:val="19"/>
-              </w:rPr>
-              <w:t xml:space="preserve">Compila, pero falla al ejecutarse.</w:t>
-            </w:r>
-            <w:r>
-              <w:rPr>
-                <w:rFonts w:ascii="Calibri" w:cs="Calibri" w:eastAsia="Calibri" w:hAnsi="Calibri"/>
-                <w:sz w:val="19"/>
-                <w:szCs w:val="19"/>
-              </w:rPr>
-              <w:t xml:space="preserve"> </w:t>
+                <w:sz w:val="19"/>
+                <w:szCs w:val="19"/>
+              </w:rPr>
+              <w:t xml:space="preserve">Compila, pero falla cuando se ejecuta. </w:t>
             </w:r>
             <w:r>
               <w:rPr>
@@ -6239,7 +6003,7 @@
                 <w:sz w:val="19"/>
                 <w:szCs w:val="19"/>
               </w:rPr>
-              <w:t xml:space="preserve"> no reporta errores de sintaxis y no inventó librerías.</w:t>
+              <w:t xml:space="preserve"> no da errores de sintaxis y todas las librerías que importa existen.</w:t>
             </w:r>
           </w:p>
           <w:p>
@@ -6268,7 +6032,7 @@
                 <w:sz w:val="19"/>
                 <w:szCs w:val="19"/>
               </w:rPr>
-              <w:t xml:space="preserve"> sin usarlo (ruff F401): el módulo del servicio no carga si el driver no está instalado, aunque se usen repositorios de prueba.</w:t>
+              <w:t xml:space="preserve"> sin usarlo (ruff F401), así que el módulo del servicio no carga si el driver no está instalado, aunque solo se usen repositorios de prueba.</w:t>
             </w:r>
           </w:p>
           <w:p>
@@ -6281,7 +6045,7 @@
                 <w:sz w:val="19"/>
                 <w:szCs w:val="19"/>
               </w:rPr>
-              <w:t xml:space="preserve">PostgreSQL entrega las columnas </w:t>
+              <w:t xml:space="preserve">PostgreSQL devuelve las columnas </w:t>
             </w:r>
             <w:r>
               <w:rPr>
@@ -6345,25 +6109,7 @@
                 <w:sz w:val="19"/>
                 <w:szCs w:val="19"/>
               </w:rPr>
-              <w:t xml:space="preserve">: </w:t>
-            </w:r>
-            <w:r>
-              <w:rPr>
-                <w:rFonts w:ascii="Calibri" w:cs="Calibri" w:eastAsia="Calibri" w:hAnsi="Calibri"/>
-                <w:b/>
-                <w:bCs/>
-                <w:sz w:val="19"/>
-                <w:szCs w:val="19"/>
-              </w:rPr>
-              <w:t xml:space="preserve">toda venta real fallaría</w:t>
-            </w:r>
-            <w:r>
-              <w:rPr>
-                <w:rFonts w:ascii="Calibri" w:cs="Calibri" w:eastAsia="Calibri" w:hAnsi="Calibri"/>
-                <w:sz w:val="19"/>
-                <w:szCs w:val="19"/>
-              </w:rPr>
-              <w:t xml:space="preserve"> (prueba </w:t>
+              <w:t xml:space="preserve">. Es decir, ninguna venta real funcionaría (prueba </w:t>
             </w:r>
             <w:r>
               <w:rPr>
@@ -6392,7 +6138,7 @@
                 <w:sz w:val="19"/>
                 <w:szCs w:val="19"/>
               </w:rPr>
-              <w:t xml:space="preserve">Con una referencia inexistente, </w:t>
+              <w:t xml:space="preserve">Si la referencia no existe, </w:t>
             </w:r>
             <w:r>
               <w:rPr>
@@ -6424,7 +6170,7 @@
                 <w:sz w:val="19"/>
                 <w:szCs w:val="19"/>
               </w:rPr>
-              <w:t xml:space="preserve"> y el desempaquetado lanza </w:t>
+              <w:t xml:space="preserve"> y el código se cae con otro </w:t>
             </w:r>
             <w:r>
               <w:rPr>
@@ -6440,7 +6186,7 @@
                 <w:sz w:val="19"/>
                 <w:szCs w:val="19"/>
               </w:rPr>
-              <w:t xml:space="preserve"> en lugar de un error de negocio.</w:t>
+              <w:t xml:space="preserve"> en vez de mostrar un error de negocio.</w:t>
             </w:r>
           </w:p>
         </w:tc>
@@ -6502,20 +6248,10 @@
             <w:r>
               <w:rPr>
                 <w:rFonts w:ascii="Calibri" w:cs="Calibri" w:eastAsia="Calibri" w:hAnsi="Calibri"/>
-                <w:b/>
-                <w:bCs/>
-                <w:sz w:val="19"/>
-                <w:szCs w:val="19"/>
-              </w:rPr>
-              <w:t xml:space="preserve">psycopg2-binary 2.9.13:</w:t>
-            </w:r>
-            <w:r>
-              <w:rPr>
-                <w:rFonts w:ascii="Calibri" w:cs="Calibri" w:eastAsia="Calibri" w:hAnsi="Calibri"/>
-                <w:sz w:val="19"/>
-                <w:szCs w:val="19"/>
-              </w:rPr>
-              <w:t xml:space="preserve"> LGPL con excepciones. Permite usarla como librería en software privado sin liberar el código propio, siempre que no se modifique la librería. Sus autores recomiendan el paquete </w:t>
+                <w:sz w:val="19"/>
+                <w:szCs w:val="19"/>
+              </w:rPr>
+              <w:t xml:space="preserve">psycopg2-binary 2.9.13 tiene licencia LGPL con excepciones. Se puede usar como librería en software privado sin publicar el código propio, siempre que no se modifique la librería. Sus autores recomiendan el paquete </w:t>
             </w:r>
             <w:r>
               <w:rPr>
@@ -6541,33 +6277,23 @@
             <w:r>
               <w:rPr>
                 <w:rFonts w:ascii="Calibri" w:cs="Calibri" w:eastAsia="Calibri" w:hAnsi="Calibri"/>
-                <w:b/>
-                <w:bCs/>
-                <w:sz w:val="19"/>
-                <w:szCs w:val="19"/>
-              </w:rPr>
-              <w:t xml:space="preserve">requests 2.34.2:</w:t>
-            </w:r>
-            <w:r>
-              <w:rPr>
-                <w:rFonts w:ascii="Calibri" w:cs="Calibri" w:eastAsia="Calibri" w:hAnsi="Calibri"/>
-                <w:sz w:val="19"/>
-                <w:szCs w:val="19"/>
-              </w:rPr>
-              <w:t xml:space="preserve"> Apache-2.0, permisiva; obliga a conservar el aviso de licencia.</w:t>
-            </w:r>
-          </w:p>
-          <w:p>
-            <w:pPr>
-              <w:spacing w:after="0"/>
-            </w:pPr>
-            <w:r>
-              <w:rPr>
-                <w:rFonts w:ascii="Calibri" w:cs="Calibri" w:eastAsia="Calibri" w:hAnsi="Calibri"/>
-                <w:sz w:val="19"/>
-                <w:szCs w:val="19"/>
-              </w:rPr>
-              <w:t xml:space="preserve">Ninguna es GPL v3. Aun así, la versión corregida no agrega dependencias: usa solo la biblioteca estándar de Python (licencia PSF).</w:t>
+                <w:sz w:val="19"/>
+                <w:szCs w:val="19"/>
+              </w:rPr>
+              <w:t xml:space="preserve">requests 2.34.2 usa Apache-2.0, que es permisiva; solo obliga a conservar el aviso de licencia.</w:t>
+            </w:r>
+          </w:p>
+          <w:p>
+            <w:pPr>
+              <w:spacing w:after="0"/>
+            </w:pPr>
+            <w:r>
+              <w:rPr>
+                <w:rFonts w:ascii="Calibri" w:cs="Calibri" w:eastAsia="Calibri" w:hAnsi="Calibri"/>
+                <w:sz w:val="19"/>
+                <w:szCs w:val="19"/>
+              </w:rPr>
+              <w:t xml:space="preserve">Ninguna es GPL v3. De todas formas, en mi versión corregida no agregué dependencias: usa solo la biblioteca estándar de Python, con licencia PSF.</w:t>
             </w:r>
           </w:p>
         </w:tc>
@@ -6632,7 +6358,7 @@
                 <w:sz w:val="19"/>
                 <w:szCs w:val="19"/>
               </w:rPr>
-              <w:t xml:space="preserve">En el prompt solo viajó el fragmento ficticio; las pruebas usan «Cliente Ficticio» y la cédula </w:t>
+              <w:t xml:space="preserve">En el prompt solo envié el fragmento ficticio, y en las pruebas usé «Cliente Ficticio» y la cédula </w:t>
             </w:r>
             <w:r>
               <w:rPr>
@@ -6661,20 +6387,20 @@
                 <w:sz w:val="19"/>
                 <w:szCs w:val="19"/>
               </w:rPr>
-              <w:t xml:space="preserve">Con datos reales: enviar solo el esquema y el código, nunca filas; reemplazar nombres, cédulas y teléfonos por datos sintéticos; usar una herramienta empresarial que no entrene con los datos; y contar con la autorización del titular y del responsable del tratamiento antes de transferirlos (Ley 1581 de 2012).</w:t>
-            </w:r>
-          </w:p>
-          <w:p>
-            <w:pPr>
-              <w:spacing w:after="0"/>
-            </w:pPr>
-            <w:r>
-              <w:rPr>
-                <w:rFonts w:ascii="Calibri" w:cs="Calibri" w:eastAsia="Calibri" w:hAnsi="Calibri"/>
-                <w:sz w:val="19"/>
-                <w:szCs w:val="19"/>
-              </w:rPr>
-              <w:t xml:space="preserve">El diseño corregido aplica minimización: la venta guarda </w:t>
+              <w:t xml:space="preserve">Si los datos fueran reales, mandaría solo el esquema y el código, nunca filas; cambiaría nombres, cédulas y teléfonos por datos inventados; usaría una herramienta empresarial que no entrene con lo que se le envía; y antes de transferir cualquier dato pediría la autorización del titular y del responsable del tratamiento (Ley 1581 de 2012).</w:t>
+            </w:r>
+          </w:p>
+          <w:p>
+            <w:pPr>
+              <w:spacing w:after="0"/>
+            </w:pPr>
+            <w:r>
+              <w:rPr>
+                <w:rFonts w:ascii="Calibri" w:cs="Calibri" w:eastAsia="Calibri" w:hAnsi="Calibri"/>
+                <w:sz w:val="19"/>
+                <w:szCs w:val="19"/>
+              </w:rPr>
+              <w:t xml:space="preserve">En el diseño corregido también apliqué minimización: la venta guarda </w:t>
             </w:r>
             <w:r>
               <w:rPr>
@@ -6690,7 +6416,7 @@
                 <w:sz w:val="19"/>
                 <w:szCs w:val="19"/>
               </w:rPr>
-              <w:t xml:space="preserve"> y no repite el nombre y la cédula en cada fila.</w:t>
+              <w:t xml:space="preserve"> y ya no repite el nombre y la cédula en cada fila.</w:t>
             </w:r>
           </w:p>
         </w:tc>
@@ -6709,16 +6435,8 @@
       <w:r>
         <w:rPr>
           <w:rFonts w:ascii="Calibri" w:cs="Calibri" w:eastAsia="Calibri" w:hAnsi="Calibri"/>
-          <w:b/>
-          <w:bCs/>
-        </w:rPr>
-        <w:t xml:space="preserve">Versión corregida por el equipo</w:t>
-      </w:r>
-      <w:r>
-        <w:rPr>
-          <w:rFonts w:ascii="Calibri" w:cs="Calibri" w:eastAsia="Calibri" w:hAnsi="Calibri"/>
-        </w:rPr>
-        <w:t xml:space="preserve"> (</w:t>
+        </w:rPr>
+        <w:t xml:space="preserve">Esta es la parte principal de mi versión corregida (</w:t>
       </w:r>
       <w:r>
         <w:rPr>
@@ -6732,7 +6450,7 @@
         <w:rPr>
           <w:rFonts w:ascii="Calibri" w:cs="Calibri" w:eastAsia="Calibri" w:hAnsi="Calibri"/>
         </w:rPr>
-        <w:t xml:space="preserve">, fragmento principal). El servicio depende de abstracciones, valida antes de cobrar, cobra antes de registrar, registra venta y stock en una sola transacción, calcula en </w:t>
+        <w:t xml:space="preserve">). El servicio depende de abstracciones, valida antes de cobrar, cobra antes de registrar, guarda la venta y el descuento de stock en una sola transacción, calcula en </w:t>
       </w:r>
       <w:r>
         <w:rPr>
@@ -6746,7 +6464,7 @@
         <w:rPr>
           <w:rFonts w:ascii="Calibri" w:cs="Calibri" w:eastAsia="Calibri" w:hAnsi="Calibri"/>
         </w:rPr>
-        <w:t xml:space="preserve"> y recibe la tasa de IVA de una política inyectable:</w:t>
+        <w:t xml:space="preserve"> y recibe la tasa de IVA de una política que se le inyecta:</w:t>
       </w:r>
     </w:p>
     <w:tbl>
@@ -7019,7 +6737,7 @@
         <w:rPr>
           <w:rFonts w:ascii="Calibri" w:cs="Calibri" w:eastAsia="Calibri" w:hAnsi="Calibri"/>
         </w:rPr>
-        <w:t xml:space="preserve">Sus 5 pruebas con SQLite en memoria pasan, incluida una referencia maliciosa (</w:t>
+        <w:t xml:space="preserve">Las 5 pruebas con SQLite en memoria pasan. Una de ellas usa la referencia maliciosa </w:t>
       </w:r>
       <w:r>
         <w:rPr>
@@ -7033,7 +6751,7 @@
         <w:rPr>
           <w:rFonts w:ascii="Calibri" w:cs="Calibri" w:eastAsia="Calibri" w:hAnsi="Calibri"/>
         </w:rPr>
-        <w:t xml:space="preserve">) que ya no encuentra ningún producto. ruff y bandit no reportan hallazgos en este archivo. Queda un riesgo residual, que se documenta: si el cobro se aprueba y luego falla la base de datos, se necesita una compensación (reversión del cobro). Por eso, en un sistema real la pasarela debería registrar primero una venta «pendiente».</w:t>
+        <w:t xml:space="preserve">, que ahora no encuentra ningún producto. ruff y bandit no reportan nada en este archivo. Dejo anotado un riesgo que todavía queda: si el cobro se aprueba y después falla la base de datos, haría falta revertir el cobro. En un sistema real, lo más seguro sería registrar primero la venta como «pendiente» y confirmarla cuando la pasarela responda.</w:t>
       </w:r>
     </w:p>
     <w:p>
@@ -7183,10 +6901,8 @@
       <w:r>
         <w:rPr>
           <w:rFonts w:ascii="Calibri" w:cs="Calibri" w:eastAsia="Calibri" w:hAnsi="Calibri"/>
-          <w:b/>
-          <w:bCs/>
-        </w:rPr>
-        <w:t xml:space="preserve">Reflexión (284 palabras)</w:t>
+        </w:rPr>
+        <w:t xml:space="preserve">Reflexión (298 palabras)</w:t>
       </w:r>
     </w:p>
     <w:p>
@@ -7197,7 +6913,7 @@
         <w:rPr>
           <w:rFonts w:ascii="Calibri" w:cs="Calibri" w:eastAsia="Calibri" w:hAnsi="Calibri"/>
         </w:rPr>
-        <w:t xml:space="preserve">Para una MiPyme detener nuevas funcionalidades durante varias semanas para refactorizar a fondo casi nunca se justifica: el dueño del gimnasio paga por resolver la fila de la recepción, no por un código elegante. Pero convivir con toda la deuda «mientras funcione» tampoco es aceptable, porque no toda la deuda cobra el mismo interés. La decisión correcta es pagar primero la deuda que puede costar dinero, datos o cumplimiento legal, y el resto pagarla de forma continua, dentro del trabajo normal.</w:t>
+        <w:t xml:space="preserve">Para una MiPyme casi nunca se justifica parar varias semanas las funcionalidades nuevas para refactorizar a fondo. El dueño del gimnasio paga para que la fila de la recepción avance más rápido, y un código más elegante no le cambia eso. Tampoco me parece aceptable dejar toda la deuda quieta mientras el sistema funcione, porque cada deuda cobra un interés distinto. Lo que yo haría es pagar primero la que puede costar dinero, datos o problemas legales, e ir pagando el resto poco a poco, dentro del trabajo normal.</w:t>
       </w:r>
     </w:p>
     <w:p>
@@ -7208,7 +6924,7 @@
         <w:rPr>
           <w:rFonts w:ascii="Calibri" w:cs="Calibri" w:eastAsia="Calibri" w:hAnsi="Calibri"/>
         </w:rPr>
-        <w:t xml:space="preserve">En FitManage la auditoría lo hizo evidente. El núcleo de dominio está sano (complejidad promedio 1,89, 98 % de cobertura), así que refactorizarlo ahora no daría retorno. En cambio, la falta de atomicidad del comprobante (DT-01), el reloj sin zona horaria (DT-07) y el control de acceso que solo existe en el navegador (DT-05) deben quedar pagados antes de usar datos reales: un ingreso duplicado o un socio mostrado como «Vencido» a las 7:30 p. m. destruyen la confianza en el sistema en una sola noche. El prototipo, con una función de complejidad 23, ni siquiera se refactoriza: se retira y se reemplaza.</w:t>
+        <w:t xml:space="preserve">La auditoría de FitManage me lo mostró. El núcleo de dominio está en buen estado (complejidad promedio de 1,89 y 98 % de cobertura), así que refactorizarlo ahora no aportaría casi nada. Pero hay tres deudas que tengo que pagar antes de usar datos reales: el comprobante que se puede duplicar (DT-01), el reloj sin zona horaria (DT-07) y el control de acceso que solo está en el navegador (DT-05). Basta un ingreso duplicado o un socio que aparece «Vencido» a las 7:30 p. m. para que el gimnasio deje de confiar en el sistema. El prototipo, que tiene una función con complejidad 23, ni lo voy a refactorizar: lo voy a reemplazar.</w:t>
       </w:r>
     </w:p>
     <w:p>
@@ -7219,7 +6935,7 @@
         <w:rPr>
           <w:rFonts w:ascii="Calibri" w:cs="Calibri" w:eastAsia="Calibri" w:hAnsi="Calibri"/>
         </w:rPr>
-        <w:t xml:space="preserve">La ausencia de pruebas automatizadas es lo que vuelve impagable la deuda. Corregir el cálculo de fechas del dominio es barato porque hay 48 pruebas que responden en 0,07 segundos; corregir la misma regla en el prototipo exigiría escribir primero al menos 23 casos de prueba solo para saber que no se rompió nada. Sin pruebas, cada refactorización se convierte en una apuesta y su costo real se multiplica.</w:t>
+        <w:t xml:space="preserve">Las pruebas automatizadas son las que deciden cuánto cuesta pagar la deuda. Corregir el cálculo de fechas en el dominio me sale barato porque hay 48 pruebas que corren en 0,07 segundos. Corregir esa misma regla en el prototipo me obligaría a escribir al menos 23 casos de prueba solo para estar seguro de no haber dañado algo, y cada cambio sin pruebas es una apuesta.</w:t>
       </w:r>
     </w:p>
     <w:p>
@@ -7230,7 +6946,7 @@
         <w:rPr>
           <w:rFonts w:ascii="Calibri" w:cs="Calibri" w:eastAsia="Calibri" w:hAnsi="Calibri"/>
         </w:rPr>
-        <w:t xml:space="preserve">Por eso mi postura es pragmática pero disciplinada: cero semanas de parálisis, una puerta de calidad que impida que la deuda crezca, y cada pago trazado a su ítem del inventario.</w:t>
+        <w:t xml:space="preserve">Por eso no pararía el desarrollo, pero sí pondría una puerta de calidad para que la deuda no siga creciendo, y cada pago quedaría ligado a su ítem del inventario.</w:t>
       </w:r>
     </w:p>
     <w:p>
@@ -8234,7 +7950,7 @@
               <w:rPr>
                 <w:rFonts w:ascii="Calibri" w:cs="Calibri" w:eastAsia="Calibri" w:hAnsi="Calibri"/>
               </w:rPr>
-              <w:t xml:space="preserve">Desarrollador único del proyecto individual: análisis, arquitectura, desarrollo, pruebas, auditoría y gestión del repositorio.</w:t>
+              <w:t xml:space="preserve">Proyecto individual. Me encargo del análisis, la arquitectura, el desarrollo, las pruebas, la auditoría y el repositorio.</w:t>
             </w:r>
           </w:p>
         </w:tc>
@@ -8318,16 +8034,8 @@
             <w:r>
               <w:rPr>
                 <w:rFonts w:ascii="Calibri" w:cs="Calibri" w:eastAsia="Calibri" w:hAnsi="Calibri"/>
-                <w:b/>
-                <w:bCs/>
-              </w:rPr>
-              <w:t xml:space="preserve">MVP al cierre de Ingeniería de Software I.</w:t>
-            </w:r>
-            <w:r>
-              <w:rPr>
-                <w:rFonts w:ascii="Calibri" w:cs="Calibri" w:eastAsia="Calibri" w:hAnsi="Calibri"/>
-              </w:rPr>
-              <w:t xml:space="preserve"> FitManage es una aplicación web responsive para gimnasios MiPyme de Cúcuta que centraliza el ciclo de la membresía: cuentas del personal por rol, registro de socios con autorización de datos, planes, pagos con vencimiento automático y renovación anticipada, consulta del estado por documento (con caché de solo lectura sin conexión), anulación auditada de pagos y reporte de ingresos y vencimientos. Los requisitos están aprobados en el ERS, la arquitectura en el DAD (monolito modular con arquitectura limpia: Django 5.2, PostgreSQL 16 y Bootstrap 5.3) y el diseño detallado en el DDS.</w:t>
+              </w:rPr>
+              <w:t xml:space="preserve">El MVP es FitManage, una aplicación web responsive para gimnasios MiPyme de Cúcuta. Reúne todo el ciclo de la membresía: cuentas del personal por rol, registro de socios con autorización de datos, planes, pagos con vencimiento automático y renovación anticipada, consulta del estado por documento (con caché de solo lectura cuando no hay conexión), anulación auditada de pagos y reporte de ingresos y vencimientos. Los requisitos quedaron aprobados en el ERS; la arquitectura, en el DAD (monolito modular con arquitectura limpia sobre Django 5.2, PostgreSQL 16 y Bootstrap 5.3), y el diseño detallado, en el DDS.</w:t>
             </w:r>
           </w:p>
           <w:p>
@@ -8337,16 +8045,8 @@
             <w:r>
               <w:rPr>
                 <w:rFonts w:ascii="Calibri" w:cs="Calibri" w:eastAsia="Calibri" w:hAnsi="Calibri"/>
-                <w:b/>
-                <w:bCs/>
-              </w:rPr>
-              <w:t xml:space="preserve">Lo construido:</w:t>
-            </w:r>
-            <w:r>
-              <w:rPr>
-                <w:rFonts w:ascii="Calibri" w:cs="Calibri" w:eastAsia="Calibri" w:hAnsi="Calibri"/>
-              </w:rPr>
-              <w:t xml:space="preserve"> el núcleo de dominio en Python puro (</w:t>
+              </w:rPr>
+              <w:t xml:space="preserve">Al cierre del semestre había construido el núcleo de dominio en Python puro (</w:t>
             </w:r>
             <w:r>
               <w:rPr>
@@ -8402,7 +8102,7 @@
               <w:rPr>
                 <w:rFonts w:ascii="Calibri" w:cs="Calibri" w:eastAsia="Calibri" w:hAnsi="Calibri"/>
               </w:rPr>
-              <w:t xml:space="preserve">) con 48 pruebas automatizadas, y el prototipo navegable v1.0 que valida la experiencia de recepción. Sin construir: la persistencia, las pantallas web reales, el inicio de sesión, </w:t>
+              <w:t xml:space="preserve">) con 48 pruebas automatizadas, y el prototipo navegable v1.0, con el que validé la experiencia de la recepción. Faltaban la persistencia, las pantallas web reales, el inicio de sesión, </w:t>
             </w:r>
             <w:r>
               <w:rPr>
@@ -8426,35 +8126,19 @@
             <w:r>
               <w:rPr>
                 <w:rFonts w:ascii="Calibri" w:cs="Calibri" w:eastAsia="Calibri" w:hAnsi="Calibri"/>
-                <w:b/>
-                <w:bCs/>
-              </w:rPr>
-              <w:t xml:space="preserve">Deuda técnica pendiente:</w:t>
-            </w:r>
-            <w:r>
-              <w:rPr>
-                <w:rFonts w:ascii="Calibri" w:cs="Calibri" w:eastAsia="Calibri" w:hAnsi="Calibri"/>
-              </w:rPr>
-              <w:t xml:space="preserve"> DT-01 (comprobante duplicado no atómico), DT-02 (sin pruebas contra la base de datos) y DT-03 (validación del teléfono y el documento solo en el formulario), todas deliberadas y prudentes.</w:t>
-            </w:r>
-          </w:p>
-          <w:p>
-            <w:pPr>
-              <w:spacing w:after="0"/>
-            </w:pPr>
-            <w:r>
-              <w:rPr>
-                <w:rFonts w:ascii="Calibri" w:cs="Calibri" w:eastAsia="Calibri" w:hAnsi="Calibri"/>
-                <w:b/>
-                <w:bCs/>
-              </w:rPr>
-              <w:t xml:space="preserve">Lecciones aprendidas:</w:t>
-            </w:r>
-            <w:r>
-              <w:rPr>
-                <w:rFonts w:ascii="Calibri" w:cs="Calibri" w:eastAsia="Calibri" w:hAnsi="Calibri"/>
-              </w:rPr>
-              <w:t xml:space="preserve"> revisar el código contra el diagrama de diseño en cada revisión; escribir pruebas de caracterización antes de refactorizar (detectaron un </w:t>
+              </w:rPr>
+              <w:t xml:space="preserve">Quedaron tres deudas registradas, todas deliberadas y prudentes: DT-01 (el comprobante duplicado no se valida de forma atómica), DT-02 (no hay pruebas contra la base de datos) y DT-03 (el teléfono y el documento solo se validan en el formulario).</w:t>
+            </w:r>
+          </w:p>
+          <w:p>
+            <w:pPr>
+              <w:spacing w:after="0"/>
+            </w:pPr>
+            <w:r>
+              <w:rPr>
+                <w:rFonts w:ascii="Calibri" w:cs="Calibri" w:eastAsia="Calibri" w:hAnsi="Calibri"/>
+              </w:rPr>
+              <w:t xml:space="preserve">Lo que aprendí: hay que comparar el código con el diagrama de diseño en cada revisión, escribir pruebas de caracterización antes de refactorizar (así detecté un </w:t>
             </w:r>
             <w:r>
               <w:rPr>
@@ -8468,7 +8152,7 @@
               <w:rPr>
                 <w:rFonts w:ascii="Calibri" w:cs="Calibri" w:eastAsia="Calibri" w:hAnsi="Calibri"/>
               </w:rPr>
-              <w:t xml:space="preserve"> cambiado por </w:t>
+              <w:t xml:space="preserve"> que la IA había cambiado por </w:t>
             </w:r>
             <w:r>
               <w:rPr>
@@ -8482,7 +8166,7 @@
               <w:rPr>
                 <w:rFonts w:ascii="Calibri" w:cs="Calibri" w:eastAsia="Calibri" w:hAnsi="Calibri"/>
               </w:rPr>
-              <w:t xml:space="preserve"> que propuso la IA); y mantener la deuda visible en el backlog, nunca oculta en el código.</w:t>
+              <w:t xml:space="preserve">) y dejar la deuda a la vista en el backlog.</w:t>
             </w:r>
           </w:p>
         </w:tc>
@@ -8664,7 +8348,7 @@
                 <w:sz w:val="19"/>
                 <w:szCs w:val="19"/>
               </w:rPr>
-              <w:t xml:space="preserve">El código pasó a un repositorio Git en GitHub (</w:t>
+              <w:t xml:space="preserve">El código ahora está en un repositorio Git en GitHub (</w:t>
             </w:r>
             <w:r>
               <w:rPr>
@@ -8680,7 +8364,7 @@
                 <w:sz w:val="19"/>
                 <w:szCs w:val="19"/>
               </w:rPr>
-              <w:t xml:space="preserve">) con historial por componente y la línea base etiquetada </w:t>
+              <w:t xml:space="preserve">), con un commit por componente y la línea base etiquetada como </w:t>
             </w:r>
             <w:r>
               <w:rPr>
@@ -8742,7 +8426,7 @@
                 <w:sz w:val="19"/>
                 <w:szCs w:val="19"/>
               </w:rPr>
-              <w:t xml:space="preserve"> entregado en la FPI-12 no estaba en control de versiones y se perdió. El núcleo se reconstruyó a partir de lo documentado en la FPI-12, con las mismas reglas y las mismas 48 pruebas.</w:t>
+              <w:t xml:space="preserve"> de la FPI-12 no estaba en control de versiones y se perdió. Reconstruí el núcleo a partir de lo que quedó documentado en la FPI-12, con las mismas reglas y las mismas 48 pruebas.</w:t>
             </w:r>
           </w:p>
         </w:tc>
@@ -8772,7 +8456,7 @@
                 <w:sz w:val="19"/>
                 <w:szCs w:val="19"/>
               </w:rPr>
-              <w:t xml:space="preserve">La evolución queda trazable commit a commit. La pérdida se registra como deuda de infraestructura (DT-08) para que no se repita.</w:t>
+              <w:t xml:space="preserve">Ahora cada cambio queda registrado commit a commit. La pérdida quedó como deuda de infraestructura (DT-08) para que no vuelva a pasar.</w:t>
             </w:r>
           </w:p>
         </w:tc>
@@ -8807,7 +8491,7 @@
                 <w:sz w:val="19"/>
                 <w:szCs w:val="19"/>
               </w:rPr>
-              <w:t xml:space="preserve">Se agregó el flujo </w:t>
+              <w:t xml:space="preserve">Agregué el flujo </w:t>
             </w:r>
             <w:r>
               <w:rPr>
@@ -8823,7 +8507,7 @@
                 <w:sz w:val="19"/>
                 <w:szCs w:val="19"/>
               </w:rPr>
-              <w:t xml:space="preserve"> de GitHub Actions con umbrales automáticos.</w:t>
+              <w:t xml:space="preserve"> en GitHub Actions, con umbrales automáticos.</w:t>
             </w:r>
           </w:p>
         </w:tc>
@@ -8853,7 +8537,7 @@
                 <w:sz w:val="19"/>
                 <w:szCs w:val="19"/>
               </w:rPr>
-              <w:t xml:space="preserve">Es la decisión del ADR N.° 01: ningún cambio entra sin pasar pruebas y análisis estático.</w:t>
+              <w:t xml:space="preserve">Es lo que decidí en el ADR N.° 01: ningún cambio entra sin pasar las pruebas y el análisis estático.</w:t>
             </w:r>
           </w:p>
         </w:tc>
@@ -8883,7 +8567,7 @@
                 <w:sz w:val="19"/>
                 <w:szCs w:val="19"/>
               </w:rPr>
-              <w:t xml:space="preserve">Cada Pull Request se valida solo (pruebas, cobertura ≥ 95 %, complejidad ≤ 10, ruff y bandit).</w:t>
+              <w:t xml:space="preserve">Cada Pull Request se revisa solo: pruebas, cobertura de al menos 95 %, complejidad máxima de 10, ruff y bandit.</w:t>
             </w:r>
           </w:p>
         </w:tc>
@@ -8948,7 +8632,7 @@
                 <w:sz w:val="19"/>
                 <w:szCs w:val="19"/>
               </w:rPr>
-              <w:t xml:space="preserve">La auditoría de esta guía incluyó el prototipo, la infraestructura y la zona horaria, no solo el dominio.</w:t>
+              <w:t xml:space="preserve">Esta vez la auditoría incluyó el prototipo, la infraestructura y la zona horaria, además del dominio.</w:t>
             </w:r>
           </w:p>
         </w:tc>
@@ -8978,7 +8662,7 @@
                 <w:sz w:val="19"/>
                 <w:szCs w:val="19"/>
               </w:rPr>
-              <w:t xml:space="preserve">Siete ítems son de impacto alto y orientan la decisión de arquitectura de la siguiente guía.</w:t>
+              <w:t xml:space="preserve">Siete de los ítems son de impacto alto, y van a pesar en la decisión de arquitectura de la siguiente guía.</w:t>
             </w:r>
           </w:p>
         </w:tc>
@@ -9183,20 +8867,20 @@
                 <w:sz w:val="19"/>
                 <w:szCs w:val="19"/>
               </w:rPr>
-              <w:t xml:space="preserve">Sin un gimnasio aliado específico todavía. FitManage está dirigido a los gimnasios MiPyme independientes de Cúcuta y Norte de Santander, que comparten el mismo problema: membresías, cobros y acceso controlados con cuadernos y hojas de cálculo.</w:t>
-            </w:r>
-          </w:p>
-          <w:p>
-            <w:pPr>
-              <w:spacing w:after="0"/>
-            </w:pPr>
-            <w:r>
-              <w:rPr>
-                <w:rFonts w:ascii="Calibri" w:cs="Calibri" w:eastAsia="Calibri" w:hAnsi="Calibri"/>
-                <w:sz w:val="19"/>
-                <w:szCs w:val="19"/>
-              </w:rPr>
-              <w:t xml:space="preserve">El perfil de cliente que guía los requisitos es el dueño del gimnasio (administrador) y su recepcionista (usuaria principal). Por eso el nombre del gimnasio es un dato configurable del sistema y no está escrito en el código.</w:t>
+              <w:t xml:space="preserve">Por ahora no hay un gimnasio aliado específico. FitManage está pensado para los gimnasios MiPyme independientes de Cúcuta y Norte de Santander, que tienen el mismo problema: llevan las membresías, los cobros y el acceso en cuadernos y hojas de cálculo.</w:t>
+            </w:r>
+          </w:p>
+          <w:p>
+            <w:pPr>
+              <w:spacing w:after="0"/>
+            </w:pPr>
+            <w:r>
+              <w:rPr>
+                <w:rFonts w:ascii="Calibri" w:cs="Calibri" w:eastAsia="Calibri" w:hAnsi="Calibri"/>
+                <w:sz w:val="19"/>
+                <w:szCs w:val="19"/>
+              </w:rPr>
+              <w:t xml:space="preserve">Los requisitos se basan en dos perfiles: el dueño del gimnasio, que es el administrador, y la recepcionista, que es la usuaria principal. Por eso el nombre del gimnasio es un dato que se configura en el sistema y no está escrito en el código.</w:t>
             </w:r>
           </w:p>
         </w:tc>
@@ -9261,20 +8945,10 @@
             <w:r>
               <w:rPr>
                 <w:rFonts w:ascii="Calibri" w:cs="Calibri" w:eastAsia="Calibri" w:hAnsi="Calibri"/>
-                <w:b/>
-                <w:bCs/>
-                <w:sz w:val="19"/>
-                <w:szCs w:val="19"/>
-              </w:rPr>
-              <w:t xml:space="preserve">Construido:</w:t>
-            </w:r>
-            <w:r>
-              <w:rPr>
-                <w:rFonts w:ascii="Calibri" w:cs="Calibri" w:eastAsia="Calibri" w:hAnsi="Calibri"/>
-                <w:sz w:val="19"/>
-                <w:szCs w:val="19"/>
-              </w:rPr>
-              <w:t xml:space="preserve"> Python 3.12 (núcleo de dominio sin dependencias de framework), pytest 9 y pytest-cov; prototipo en HTML5, CSS y JavaScript sin librerías.</w:t>
+                <w:sz w:val="19"/>
+                <w:szCs w:val="19"/>
+              </w:rPr>
+              <w:t xml:space="preserve">Lo que ya está construido usa Python 3.12 para el núcleo de dominio (sin depender de ningún framework), con pytest 9 y pytest-cov. El prototipo está hecho en HTML5, CSS y JavaScript, sin librerías.</w:t>
             </w:r>
           </w:p>
           <w:p>
@@ -9284,20 +8958,10 @@
             <w:r>
               <w:rPr>
                 <w:rFonts w:ascii="Calibri" w:cs="Calibri" w:eastAsia="Calibri" w:hAnsi="Calibri"/>
-                <w:b/>
-                <w:bCs/>
-                <w:sz w:val="19"/>
-                <w:szCs w:val="19"/>
-              </w:rPr>
-              <w:t xml:space="preserve">Calidad:</w:t>
-            </w:r>
-            <w:r>
-              <w:rPr>
-                <w:rFonts w:ascii="Calibri" w:cs="Calibri" w:eastAsia="Calibri" w:hAnsi="Calibri"/>
-                <w:sz w:val="19"/>
-                <w:szCs w:val="19"/>
-              </w:rPr>
-              <w:t xml:space="preserve"> ruff, radon, pylint, bandit, pip-audit, lizard y SonarCloud (</w:t>
+                <w:sz w:val="19"/>
+                <w:szCs w:val="19"/>
+              </w:rPr>
+              <w:t xml:space="preserve">Para revisar la calidad uso ruff, radon, pylint, bandit, pip-audit y lizard, y SonarCloud queda configurado en </w:t>
             </w:r>
             <w:r>
               <w:rPr>
@@ -9313,30 +8977,20 @@
                 <w:sz w:val="19"/>
                 <w:szCs w:val="19"/>
               </w:rPr>
-              <w:t xml:space="preserve">), ejecutados en GitHub Actions.</w:t>
-            </w:r>
-          </w:p>
-          <w:p>
-            <w:pPr>
-              <w:spacing w:after="0"/>
-            </w:pPr>
-            <w:r>
-              <w:rPr>
-                <w:rFonts w:ascii="Calibri" w:cs="Calibri" w:eastAsia="Calibri" w:hAnsi="Calibri"/>
-                <w:b/>
-                <w:bCs/>
-                <w:sz w:val="19"/>
-                <w:szCs w:val="19"/>
-              </w:rPr>
-              <w:t xml:space="preserve">Definido en el DAD para la evolución:</w:t>
-            </w:r>
-            <w:r>
-              <w:rPr>
-                <w:rFonts w:ascii="Calibri" w:cs="Calibri" w:eastAsia="Calibri" w:hAnsi="Calibri"/>
-                <w:sz w:val="19"/>
-                <w:szCs w:val="19"/>
-              </w:rPr>
-              <w:t xml:space="preserve"> Django 5.2 LTS, PostgreSQL 16, Bootstrap 5.3, Service Worker y despliegue en PaaS.</w:t>
+              <w:t xml:space="preserve">. Todo corre en GitHub Actions.</w:t>
+            </w:r>
+          </w:p>
+          <w:p>
+            <w:pPr>
+              <w:spacing w:after="0"/>
+            </w:pPr>
+            <w:r>
+              <w:rPr>
+                <w:rFonts w:ascii="Calibri" w:cs="Calibri" w:eastAsia="Calibri" w:hAnsi="Calibri"/>
+                <w:sz w:val="19"/>
+                <w:szCs w:val="19"/>
+              </w:rPr>
+              <w:t xml:space="preserve">Según el DAD, el sistema va a crecer con Django 5.2 LTS, PostgreSQL 16, Bootstrap 5.3, un Service Worker y despliegue en una plataforma PaaS.</w:t>
             </w:r>
           </w:p>
         </w:tc>
@@ -10047,20 +9701,10 @@
             <w:r>
               <w:rPr>
                 <w:rFonts w:ascii="Calibri" w:cs="Calibri" w:eastAsia="Calibri" w:hAnsi="Calibri"/>
-                <w:b/>
-                <w:bCs/>
-                <w:sz w:val="17"/>
-                <w:szCs w:val="17"/>
-              </w:rPr>
-              <w:t xml:space="preserve">DT-01</w:t>
-            </w:r>
-            <w:r>
-              <w:rPr>
-                <w:rFonts w:ascii="Calibri" w:cs="Calibri" w:eastAsia="Calibri" w:hAnsi="Calibri"/>
-                <w:sz w:val="17"/>
-                <w:szCs w:val="17"/>
-              </w:rPr>
-              <w:t xml:space="preserve"> Comprobante duplicado (RN-06): la verificación y el guardado no son atómicos.</w:t>
+                <w:sz w:val="17"/>
+                <w:szCs w:val="17"/>
+              </w:rPr>
+              <w:t xml:space="preserve">DT-01. Comprobante duplicado (RN-06): la verificación y el guardado no ocurren en un solo paso atómico.</w:t>
             </w:r>
           </w:p>
         </w:tc>
@@ -10141,7 +9785,7 @@
                 <w:sz w:val="17"/>
                 <w:szCs w:val="17"/>
               </w:rPr>
-              <w:t xml:space="preserve">, líneas 91–100</w:t>
+              <w:t xml:space="preserve">, líneas 91 a 100</w:t>
             </w:r>
           </w:p>
         </w:tc>
@@ -10168,20 +9812,10 @@
             <w:r>
               <w:rPr>
                 <w:rFonts w:ascii="Calibri" w:cs="Calibri" w:eastAsia="Calibri" w:hAnsi="Calibri"/>
-                <w:b/>
-                <w:bCs/>
-                <w:sz w:val="17"/>
-                <w:szCs w:val="17"/>
-              </w:rPr>
-              <w:t xml:space="preserve">Alto:</w:t>
-            </w:r>
-            <w:r>
-              <w:rPr>
-                <w:rFonts w:ascii="Calibri" w:cs="Calibri" w:eastAsia="Calibri" w:hAnsi="Calibri"/>
-                <w:sz w:val="17"/>
-                <w:szCs w:val="17"/>
-              </w:rPr>
-              <w:t xml:space="preserve"> dos recepcionistas pueden registrar la misma referencia y duplicar un ingreso.</w:t>
+                <w:sz w:val="17"/>
+                <w:szCs w:val="17"/>
+              </w:rPr>
+              <w:t xml:space="preserve">Alto. Si dos recepcionistas registran la misma referencia al tiempo, el ingreso queda duplicado.</w:t>
             </w:r>
           </w:p>
         </w:tc>
@@ -10208,20 +9842,10 @@
             <w:r>
               <w:rPr>
                 <w:rFonts w:ascii="Calibri" w:cs="Calibri" w:eastAsia="Calibri" w:hAnsi="Calibri"/>
-                <w:b/>
-                <w:bCs/>
-                <w:sz w:val="17"/>
-                <w:szCs w:val="17"/>
-              </w:rPr>
-              <w:t xml:space="preserve">Semana 4:</w:t>
-            </w:r>
-            <w:r>
-              <w:rPr>
-                <w:rFonts w:ascii="Calibri" w:cs="Calibri" w:eastAsia="Calibri" w:hAnsi="Calibri"/>
-                <w:sz w:val="17"/>
-                <w:szCs w:val="17"/>
-              </w:rPr>
-              <w:t xml:space="preserve"> índice único parcial en PostgreSQL y prueba con dos registros simultáneos.</w:t>
+                <w:sz w:val="17"/>
+                <w:szCs w:val="17"/>
+              </w:rPr>
+              <w:t xml:space="preserve">Semana 4: índice único parcial en PostgreSQL y una prueba con dos registros simultáneos.</w:t>
             </w:r>
           </w:p>
         </w:tc>
@@ -10253,20 +9877,10 @@
             <w:r>
               <w:rPr>
                 <w:rFonts w:ascii="Calibri" w:cs="Calibri" w:eastAsia="Calibri" w:hAnsi="Calibri"/>
-                <w:b/>
-                <w:bCs/>
-                <w:sz w:val="17"/>
-                <w:szCs w:val="17"/>
-              </w:rPr>
-              <w:t xml:space="preserve">DT-02</w:t>
-            </w:r>
-            <w:r>
-              <w:rPr>
-                <w:rFonts w:ascii="Calibri" w:cs="Calibri" w:eastAsia="Calibri" w:hAnsi="Calibri"/>
-                <w:sz w:val="17"/>
-                <w:szCs w:val="17"/>
-              </w:rPr>
-              <w:t xml:space="preserve"> Todas las pruebas usan repositorios en memoria.</w:t>
+                <w:sz w:val="17"/>
+                <w:szCs w:val="17"/>
+              </w:rPr>
+              <w:t xml:space="preserve">DT-02. Todas las pruebas usan repositorios en memoria.</w:t>
             </w:r>
           </w:p>
         </w:tc>
@@ -10366,20 +9980,10 @@
             <w:r>
               <w:rPr>
                 <w:rFonts w:ascii="Calibri" w:cs="Calibri" w:eastAsia="Calibri" w:hAnsi="Calibri"/>
-                <w:b/>
-                <w:bCs/>
-                <w:sz w:val="17"/>
-                <w:szCs w:val="17"/>
-              </w:rPr>
-              <w:t xml:space="preserve">Alto:</w:t>
-            </w:r>
-            <w:r>
-              <w:rPr>
-                <w:rFonts w:ascii="Calibri" w:cs="Calibri" w:eastAsia="Calibri" w:hAnsi="Calibri"/>
-                <w:sz w:val="17"/>
-                <w:szCs w:val="17"/>
-              </w:rPr>
-              <w:t xml:space="preserve"> no se ha verificado el comportamiento con PostgreSQL.</w:t>
+                <w:sz w:val="17"/>
+                <w:szCs w:val="17"/>
+              </w:rPr>
+              <w:t xml:space="preserve">Alto. No se ha comprobado cómo funciona todo con PostgreSQL.</w:t>
             </w:r>
           </w:p>
         </w:tc>
@@ -10406,20 +10010,10 @@
             <w:r>
               <w:rPr>
                 <w:rFonts w:ascii="Calibri" w:cs="Calibri" w:eastAsia="Calibri" w:hAnsi="Calibri"/>
-                <w:b/>
-                <w:bCs/>
-                <w:sz w:val="17"/>
-                <w:szCs w:val="17"/>
-              </w:rPr>
-              <w:t xml:space="preserve">Semanas 4–5:</w:t>
-            </w:r>
-            <w:r>
-              <w:rPr>
-                <w:rFonts w:ascii="Calibri" w:cs="Calibri" w:eastAsia="Calibri" w:hAnsi="Calibri"/>
-                <w:sz w:val="17"/>
-                <w:szCs w:val="17"/>
-              </w:rPr>
-              <w:t xml:space="preserve"> repositorios con Django ORM y las mismas pruebas como contrato, con PostgreSQL 16 en GitHub Actions.</w:t>
+                <w:sz w:val="17"/>
+                <w:szCs w:val="17"/>
+              </w:rPr>
+              <w:t xml:space="preserve">Semanas 4 y 5: repositorios con Django ORM y las mismas pruebas como contrato, corriendo con PostgreSQL 16 en GitHub Actions.</w:t>
             </w:r>
           </w:p>
         </w:tc>
@@ -10451,20 +10045,10 @@
             <w:r>
               <w:rPr>
                 <w:rFonts w:ascii="Calibri" w:cs="Calibri" w:eastAsia="Calibri" w:hAnsi="Calibri"/>
-                <w:b/>
-                <w:bCs/>
-                <w:sz w:val="17"/>
-                <w:szCs w:val="17"/>
-              </w:rPr>
-              <w:t xml:space="preserve">DT-03</w:t>
-            </w:r>
-            <w:r>
-              <w:rPr>
-                <w:rFonts w:ascii="Calibri" w:cs="Calibri" w:eastAsia="Calibri" w:hAnsi="Calibri"/>
-                <w:sz w:val="17"/>
-                <w:szCs w:val="17"/>
-              </w:rPr>
-              <w:t xml:space="preserve"> </w:t>
+                <w:sz w:val="17"/>
+                <w:szCs w:val="17"/>
+              </w:rPr>
+              <w:t xml:space="preserve">DT-03. </w:t>
             </w:r>
             <w:r>
               <w:rPr>
@@ -10561,7 +10145,7 @@
                 <w:sz w:val="17"/>
                 <w:szCs w:val="17"/>
               </w:rPr>
-              <w:t xml:space="preserve">, líneas 50–65; prototipo, línea 163</w:t>
+              <w:t xml:space="preserve">, líneas 50 a 65; prototipo, línea 163</w:t>
             </w:r>
           </w:p>
         </w:tc>
@@ -10588,20 +10172,10 @@
             <w:r>
               <w:rPr>
                 <w:rFonts w:ascii="Calibri" w:cs="Calibri" w:eastAsia="Calibri" w:hAnsi="Calibri"/>
-                <w:b/>
-                <w:bCs/>
-                <w:sz w:val="17"/>
-                <w:szCs w:val="17"/>
-              </w:rPr>
-              <w:t xml:space="preserve">Medio:</w:t>
-            </w:r>
-            <w:r>
-              <w:rPr>
-                <w:rFonts w:ascii="Calibri" w:cs="Calibri" w:eastAsia="Calibri" w:hAnsi="Calibri"/>
-                <w:sz w:val="17"/>
-                <w:szCs w:val="17"/>
-              </w:rPr>
-              <w:t xml:space="preserve"> datos inválidos y recordatorios de WhatsApp a números inexistentes.</w:t>
+                <w:sz w:val="17"/>
+                <w:szCs w:val="17"/>
+              </w:rPr>
+              <w:t xml:space="preserve">Medio. Pueden entrar datos inválidos, y los recordatorios de WhatsApp irían a números que no existen.</w:t>
             </w:r>
           </w:p>
         </w:tc>
@@ -10628,20 +10202,10 @@
             <w:r>
               <w:rPr>
                 <w:rFonts w:ascii="Calibri" w:cs="Calibri" w:eastAsia="Calibri" w:hAnsi="Calibri"/>
-                <w:b/>
-                <w:bCs/>
-                <w:sz w:val="17"/>
-                <w:szCs w:val="17"/>
-              </w:rPr>
-              <w:t xml:space="preserve">Semana 2:</w:t>
-            </w:r>
-            <w:r>
-              <w:rPr>
-                <w:rFonts w:ascii="Calibri" w:cs="Calibri" w:eastAsia="Calibri" w:hAnsi="Calibri"/>
-                <w:sz w:val="17"/>
-                <w:szCs w:val="17"/>
-              </w:rPr>
-              <w:t xml:space="preserve"> objetos de valor </w:t>
+                <w:sz w:val="17"/>
+                <w:szCs w:val="17"/>
+              </w:rPr>
+              <w:t xml:space="preserve">Semana 2: objetos de valor </w:t>
             </w:r>
             <w:r>
               <w:rPr>
@@ -10673,7 +10237,7 @@
                 <w:sz w:val="17"/>
                 <w:szCs w:val="17"/>
               </w:rPr>
-              <w:t xml:space="preserve"> con pruebas.</w:t>
+              <w:t xml:space="preserve">, con sus pruebas.</w:t>
             </w:r>
           </w:p>
         </w:tc>
@@ -10705,20 +10269,10 @@
             <w:r>
               <w:rPr>
                 <w:rFonts w:ascii="Calibri" w:cs="Calibri" w:eastAsia="Calibri" w:hAnsi="Calibri"/>
-                <w:b/>
-                <w:bCs/>
-                <w:sz w:val="17"/>
-                <w:szCs w:val="17"/>
-              </w:rPr>
-              <w:t xml:space="preserve">DT-04</w:t>
-            </w:r>
-            <w:r>
-              <w:rPr>
-                <w:rFonts w:ascii="Calibri" w:cs="Calibri" w:eastAsia="Calibri" w:hAnsi="Calibri"/>
-                <w:sz w:val="17"/>
-                <w:szCs w:val="17"/>
-              </w:rPr>
-              <w:t xml:space="preserve"> El prototipo reimplementa RN-03 a RN-06 en JavaScript, con fechas y comprobantes fijos.</w:t>
+                <w:sz w:val="17"/>
+                <w:szCs w:val="17"/>
+              </w:rPr>
+              <w:t xml:space="preserve">DT-04. El prototipo repite RN-03 a RN-06 en JavaScript, con fechas y comprobantes escritos a mano.</w:t>
             </w:r>
           </w:p>
         </w:tc>
@@ -10826,20 +10380,10 @@
             <w:r>
               <w:rPr>
                 <w:rFonts w:ascii="Calibri" w:cs="Calibri" w:eastAsia="Calibri" w:hAnsi="Calibri"/>
-                <w:b/>
-                <w:bCs/>
-                <w:sz w:val="17"/>
-                <w:szCs w:val="17"/>
-              </w:rPr>
-              <w:t xml:space="preserve">Alto:</w:t>
-            </w:r>
-            <w:r>
-              <w:rPr>
-                <w:rFonts w:ascii="Calibri" w:cs="Calibri" w:eastAsia="Calibri" w:hAnsi="Calibri"/>
-                <w:sz w:val="17"/>
-                <w:szCs w:val="17"/>
-              </w:rPr>
-              <w:t xml:space="preserve"> dos fuentes de verdad para reglas de dinero.</w:t>
+                <w:sz w:val="17"/>
+                <w:szCs w:val="17"/>
+              </w:rPr>
+              <w:t xml:space="preserve">Alto. Las reglas de dinero quedan en dos sitios distintos.</w:t>
             </w:r>
           </w:p>
         </w:tc>
@@ -10866,20 +10410,10 @@
             <w:r>
               <w:rPr>
                 <w:rFonts w:ascii="Calibri" w:cs="Calibri" w:eastAsia="Calibri" w:hAnsi="Calibri"/>
-                <w:b/>
-                <w:bCs/>
-                <w:sz w:val="17"/>
-                <w:szCs w:val="17"/>
-              </w:rPr>
-              <w:t xml:space="preserve">Semanas 5–6:</w:t>
-            </w:r>
-            <w:r>
-              <w:rPr>
-                <w:rFonts w:ascii="Calibri" w:cs="Calibri" w:eastAsia="Calibri" w:hAnsi="Calibri"/>
-                <w:sz w:val="17"/>
-                <w:szCs w:val="17"/>
-              </w:rPr>
-              <w:t xml:space="preserve"> la interfaz Django consume los servicios del dominio; el prototipo se congela como referencia visual.</w:t>
+                <w:sz w:val="17"/>
+                <w:szCs w:val="17"/>
+              </w:rPr>
+              <w:t xml:space="preserve">Semanas 5 y 6: la interfaz en Django usará los servicios del dominio, y el prototipo se queda como referencia visual.</w:t>
             </w:r>
           </w:p>
         </w:tc>
@@ -10911,20 +10445,10 @@
             <w:r>
               <w:rPr>
                 <w:rFonts w:ascii="Calibri" w:cs="Calibri" w:eastAsia="Calibri" w:hAnsi="Calibri"/>
-                <w:b/>
-                <w:bCs/>
-                <w:sz w:val="17"/>
-                <w:szCs w:val="17"/>
-              </w:rPr>
-              <w:t xml:space="preserve">DT-05</w:t>
-            </w:r>
-            <w:r>
-              <w:rPr>
-                <w:rFonts w:ascii="Calibri" w:cs="Calibri" w:eastAsia="Calibri" w:hAnsi="Calibri"/>
-                <w:sz w:val="17"/>
-                <w:szCs w:val="17"/>
-              </w:rPr>
-              <w:t xml:space="preserve"> Control de acceso solo en el navegador y contraseña de demostración en el código.</w:t>
+                <w:sz w:val="17"/>
+                <w:szCs w:val="17"/>
+              </w:rPr>
+              <w:t xml:space="preserve">DT-05. El control de acceso solo está en el navegador y la contraseña de demostración está en el código.</w:t>
             </w:r>
           </w:p>
         </w:tc>
@@ -11024,20 +10548,10 @@
             <w:r>
               <w:rPr>
                 <w:rFonts w:ascii="Calibri" w:cs="Calibri" w:eastAsia="Calibri" w:hAnsi="Calibri"/>
-                <w:b/>
-                <w:bCs/>
-                <w:sz w:val="17"/>
-                <w:szCs w:val="17"/>
-              </w:rPr>
-              <w:t xml:space="preserve">Alto:</w:t>
-            </w:r>
-            <w:r>
-              <w:rPr>
-                <w:rFonts w:ascii="Calibri" w:cs="Calibri" w:eastAsia="Calibri" w:hAnsi="Calibri"/>
-                <w:sz w:val="17"/>
-                <w:szCs w:val="17"/>
-              </w:rPr>
-              <w:t xml:space="preserve"> la restricción se salta desde el navegador; incumple RNF-05.</w:t>
+                <w:sz w:val="17"/>
+                <w:szCs w:val="17"/>
+              </w:rPr>
+              <w:t xml:space="preserve">Alto. La restricción se puede saltar desde el navegador, y eso incumple RNF-05.</w:t>
             </w:r>
           </w:p>
         </w:tc>
@@ -11064,20 +10578,10 @@
             <w:r>
               <w:rPr>
                 <w:rFonts w:ascii="Calibri" w:cs="Calibri" w:eastAsia="Calibri" w:hAnsi="Calibri"/>
-                <w:b/>
-                <w:bCs/>
-                <w:sz w:val="17"/>
-                <w:szCs w:val="17"/>
-              </w:rPr>
-              <w:t xml:space="preserve">Semana 5:</w:t>
-            </w:r>
-            <w:r>
-              <w:rPr>
-                <w:rFonts w:ascii="Calibri" w:cs="Calibri" w:eastAsia="Calibri" w:hAnsi="Calibri"/>
-                <w:sz w:val="17"/>
-                <w:szCs w:val="17"/>
-              </w:rPr>
-              <w:t xml:space="preserve"> </w:t>
+                <w:sz w:val="17"/>
+                <w:szCs w:val="17"/>
+              </w:rPr>
+              <w:t xml:space="preserve">Semana 5: </w:t>
             </w:r>
             <w:r>
               <w:rPr>
@@ -11093,7 +10597,7 @@
                 <w:sz w:val="17"/>
                 <w:szCs w:val="17"/>
               </w:rPr>
-              <w:t xml:space="preserve"> en el servidor con pruebas 403 y secretos solo en variables de entorno.</w:t>
+              <w:t xml:space="preserve"> en el servidor con pruebas de error 403, y los secretos solo en variables de entorno.</w:t>
             </w:r>
           </w:p>
         </w:tc>
@@ -11125,20 +10629,10 @@
             <w:r>
               <w:rPr>
                 <w:rFonts w:ascii="Calibri" w:cs="Calibri" w:eastAsia="Calibri" w:hAnsi="Calibri"/>
-                <w:b/>
-                <w:bCs/>
-                <w:sz w:val="17"/>
-                <w:szCs w:val="17"/>
-              </w:rPr>
-              <w:t xml:space="preserve">DT-06</w:t>
-            </w:r>
-            <w:r>
-              <w:rPr>
-                <w:rFonts w:ascii="Calibri" w:cs="Calibri" w:eastAsia="Calibri" w:hAnsi="Calibri"/>
-                <w:sz w:val="17"/>
-                <w:szCs w:val="17"/>
-              </w:rPr>
-              <w:t xml:space="preserve"> Un manejador de clics con 13 acciones y complejidad 23; dos manejadores </w:t>
+                <w:sz w:val="17"/>
+                <w:szCs w:val="17"/>
+              </w:rPr>
+              <w:t xml:space="preserve">DT-06. Una función atiende 13 acciones de clic y tiene complejidad 23; además hay dos manejadores </w:t>
             </w:r>
             <w:r>
               <w:rPr>
@@ -11227,7 +10721,7 @@
                 <w:sz w:val="17"/>
                 <w:szCs w:val="17"/>
               </w:rPr>
-              <w:t xml:space="preserve">Prototipo, líneas 335, 348–372 y 373</w:t>
+              <w:t xml:space="preserve">Prototipo, líneas 335, 348 a 372 y 373</w:t>
             </w:r>
           </w:p>
         </w:tc>
@@ -11254,20 +10748,10 @@
             <w:r>
               <w:rPr>
                 <w:rFonts w:ascii="Calibri" w:cs="Calibri" w:eastAsia="Calibri" w:hAnsi="Calibri"/>
-                <w:b/>
-                <w:bCs/>
-                <w:sz w:val="17"/>
-                <w:szCs w:val="17"/>
-              </w:rPr>
-              <w:t xml:space="preserve">Medio:</w:t>
-            </w:r>
-            <w:r>
-              <w:rPr>
-                <w:rFonts w:ascii="Calibri" w:cs="Calibri" w:eastAsia="Calibri" w:hAnsi="Calibri"/>
-                <w:sz w:val="17"/>
-                <w:szCs w:val="17"/>
-              </w:rPr>
-              <w:t xml:space="preserve"> se necesitarían 23 casos de prueba para cubrirlo.</w:t>
+                <w:sz w:val="17"/>
+                <w:szCs w:val="17"/>
+              </w:rPr>
+              <w:t xml:space="preserve">Medio. Harían falta 23 casos de prueba para cubrirla.</w:t>
             </w:r>
           </w:p>
         </w:tc>
@@ -11297,7 +10781,7 @@
                 <w:sz w:val="17"/>
                 <w:szCs w:val="17"/>
               </w:rPr>
-              <w:t xml:space="preserve">Se paga al retirar el prototipo (DT-04). El flujo </w:t>
+              <w:t xml:space="preserve">Se paga cuando se retire el prototipo (DT-04). El flujo </w:t>
             </w:r>
             <w:r>
               <w:rPr>
@@ -11313,7 +10797,7 @@
                 <w:sz w:val="17"/>
                 <w:szCs w:val="17"/>
               </w:rPr>
-              <w:t xml:space="preserve"> rechaza complejidades mayores que 10.</w:t>
+              <w:t xml:space="preserve"> no deja pasar complejidades mayores de 10.</w:t>
             </w:r>
           </w:p>
         </w:tc>
@@ -11345,20 +10829,10 @@
             <w:r>
               <w:rPr>
                 <w:rFonts w:ascii="Calibri" w:cs="Calibri" w:eastAsia="Calibri" w:hAnsi="Calibri"/>
-                <w:b/>
-                <w:bCs/>
-                <w:sz w:val="17"/>
-                <w:szCs w:val="17"/>
-              </w:rPr>
-              <w:t xml:space="preserve">DT-07</w:t>
-            </w:r>
-            <w:r>
-              <w:rPr>
-                <w:rFonts w:ascii="Calibri" w:cs="Calibri" w:eastAsia="Calibri" w:hAnsi="Calibri"/>
-                <w:sz w:val="17"/>
-                <w:szCs w:val="17"/>
-              </w:rPr>
-              <w:t xml:space="preserve"> </w:t>
+                <w:sz w:val="17"/>
+                <w:szCs w:val="17"/>
+              </w:rPr>
+              <w:t xml:space="preserve">DT-07. </w:t>
             </w:r>
             <w:r>
               <w:rPr>
@@ -11390,7 +10864,7 @@
                 <w:sz w:val="17"/>
                 <w:szCs w:val="17"/>
               </w:rPr>
-              <w:t xml:space="preserve"> aceptan fechas sin zona horaria; no existe </w:t>
+              <w:t xml:space="preserve"> aceptan fechas sin zona horaria y no existe </w:t>
             </w:r>
             <w:r>
               <w:rPr>
@@ -11406,7 +10880,7 @@
                 <w:sz w:val="17"/>
                 <w:szCs w:val="17"/>
               </w:rPr>
-              <w:t xml:space="preserve"> (13 avisos DTZ001).</w:t>
+              <w:t xml:space="preserve">; ruff marca 13 avisos DTZ001.</w:t>
             </w:r>
           </w:p>
         </w:tc>
@@ -11487,7 +10961,7 @@
                 <w:sz w:val="17"/>
                 <w:szCs w:val="17"/>
               </w:rPr>
-              <w:t xml:space="preserve">, líneas 33–39; </w:t>
+              <w:t xml:space="preserve">, líneas 33 a 39; </w:t>
             </w:r>
             <w:r>
               <w:rPr>
@@ -11530,20 +11004,10 @@
             <w:r>
               <w:rPr>
                 <w:rFonts w:ascii="Calibri" w:cs="Calibri" w:eastAsia="Calibri" w:hAnsi="Calibri"/>
-                <w:b/>
-                <w:bCs/>
-                <w:sz w:val="17"/>
-                <w:szCs w:val="17"/>
-              </w:rPr>
-              <w:t xml:space="preserve">Alto:</w:t>
-            </w:r>
-            <w:r>
-              <w:rPr>
-                <w:rFonts w:ascii="Calibri" w:cs="Calibri" w:eastAsia="Calibri" w:hAnsi="Calibri"/>
-                <w:sz w:val="17"/>
-                <w:szCs w:val="17"/>
-              </w:rPr>
-              <w:t xml:space="preserve"> después de las 7:00 p. m., un servidor en UTC mostraría «Vencido» a quien vence hoy.</w:t>
+                <w:sz w:val="17"/>
+                <w:szCs w:val="17"/>
+              </w:rPr>
+              <w:t xml:space="preserve">Alto. Después de las 7:00 p. m., un servidor en UTC mostraría «Vencido» a alguien que vence ese día.</w:t>
             </w:r>
           </w:p>
         </w:tc>
@@ -11570,20 +11034,10 @@
             <w:r>
               <w:rPr>
                 <w:rFonts w:ascii="Calibri" w:cs="Calibri" w:eastAsia="Calibri" w:hAnsi="Calibri"/>
-                <w:b/>
-                <w:bCs/>
-                <w:sz w:val="17"/>
-                <w:szCs w:val="17"/>
-              </w:rPr>
-              <w:t xml:space="preserve">Semana 2:</w:t>
-            </w:r>
-            <w:r>
-              <w:rPr>
-                <w:rFonts w:ascii="Calibri" w:cs="Calibri" w:eastAsia="Calibri" w:hAnsi="Calibri"/>
-                <w:sz w:val="17"/>
-                <w:szCs w:val="17"/>
-              </w:rPr>
-              <w:t xml:space="preserve"> </w:t>
+                <w:sz w:val="17"/>
+                <w:szCs w:val="17"/>
+              </w:rPr>
+              <w:t xml:space="preserve">Semana 2: </w:t>
             </w:r>
             <w:r>
               <w:rPr>
@@ -11615,7 +11069,7 @@
                 <w:sz w:val="17"/>
                 <w:szCs w:val="17"/>
               </w:rPr>
-              <w:t xml:space="preserve">, invariante de zona horaria en </w:t>
+              <w:t xml:space="preserve">, una regla en </w:t>
             </w:r>
             <w:r>
               <w:rPr>
@@ -11631,7 +11085,7 @@
                 <w:sz w:val="17"/>
                 <w:szCs w:val="17"/>
               </w:rPr>
-              <w:t xml:space="preserve"> y regla DTZ en ruff.</w:t>
+              <w:t xml:space="preserve"> que exija zona horaria y la regla DTZ activa en ruff.</w:t>
             </w:r>
           </w:p>
         </w:tc>
@@ -11663,20 +11117,10 @@
             <w:r>
               <w:rPr>
                 <w:rFonts w:ascii="Calibri" w:cs="Calibri" w:eastAsia="Calibri" w:hAnsi="Calibri"/>
-                <w:b/>
-                <w:bCs/>
-                <w:sz w:val="17"/>
-                <w:szCs w:val="17"/>
-              </w:rPr>
-              <w:t xml:space="preserve">DT-08</w:t>
-            </w:r>
-            <w:r>
-              <w:rPr>
-                <w:rFonts w:ascii="Calibri" w:cs="Calibri" w:eastAsia="Calibri" w:hAnsi="Calibri"/>
-                <w:sz w:val="17"/>
-                <w:szCs w:val="17"/>
-              </w:rPr>
-              <w:t xml:space="preserve"> El código vivía en un </w:t>
+                <w:sz w:val="17"/>
+                <w:szCs w:val="17"/>
+              </w:rPr>
+              <w:t xml:space="preserve">DT-08. El código estaba en un </w:t>
             </w:r>
             <w:r>
               <w:rPr>
@@ -11692,7 +11136,7 @@
                 <w:sz w:val="17"/>
                 <w:szCs w:val="17"/>
               </w:rPr>
-              <w:t xml:space="preserve"> sin control de versiones y se perdió; no había CI ni entorno reproducible.</w:t>
+              <w:t xml:space="preserve"> sin control de versiones y se perdió; no había integración continua ni un entorno que se pudiera reproducir.</w:t>
             </w:r>
           </w:p>
         </w:tc>
@@ -11792,20 +11236,10 @@
             <w:r>
               <w:rPr>
                 <w:rFonts w:ascii="Calibri" w:cs="Calibri" w:eastAsia="Calibri" w:hAnsi="Calibri"/>
-                <w:b/>
-                <w:bCs/>
-                <w:sz w:val="17"/>
-                <w:szCs w:val="17"/>
-              </w:rPr>
-              <w:t xml:space="preserve">Alto:</w:t>
-            </w:r>
-            <w:r>
-              <w:rPr>
-                <w:rFonts w:ascii="Calibri" w:cs="Calibri" w:eastAsia="Calibri" w:hAnsi="Calibri"/>
-                <w:sz w:val="17"/>
-                <w:szCs w:val="17"/>
-              </w:rPr>
-              <w:t xml:space="preserve"> pérdida de historia y de evidencia.</w:t>
+                <w:sz w:val="17"/>
+                <w:szCs w:val="17"/>
+              </w:rPr>
+              <w:t xml:space="preserve">Alto. Se perdió el historial y parte de la evidencia.</w:t>
             </w:r>
           </w:p>
         </w:tc>
@@ -11835,7 +11269,7 @@
                 <w:sz w:val="17"/>
                 <w:szCs w:val="17"/>
               </w:rPr>
-              <w:t xml:space="preserve">Pagado en parte en esta ficha (GitHub, </w:t>
+              <w:t xml:space="preserve">Una parte ya la pagué en esta ficha (GitHub, </w:t>
             </w:r>
             <w:r>
               <w:rPr>
@@ -11851,7 +11285,7 @@
                 <w:sz w:val="17"/>
                 <w:szCs w:val="17"/>
               </w:rPr>
-              <w:t xml:space="preserve"> y flujo </w:t>
+              <w:t xml:space="preserve"> y el flujo </w:t>
             </w:r>
             <w:r>
               <w:rPr>
@@ -11867,25 +11301,7 @@
                 <w:sz w:val="17"/>
                 <w:szCs w:val="17"/>
               </w:rPr>
-              <w:t xml:space="preserve">). </w:t>
-            </w:r>
-            <w:r>
-              <w:rPr>
-                <w:rFonts w:ascii="Calibri" w:cs="Calibri" w:eastAsia="Calibri" w:hAnsi="Calibri"/>
-                <w:b/>
-                <w:bCs/>
-                <w:sz w:val="17"/>
-                <w:szCs w:val="17"/>
-              </w:rPr>
-              <w:t xml:space="preserve">Semana 3:</w:t>
-            </w:r>
-            <w:r>
-              <w:rPr>
-                <w:rFonts w:ascii="Calibri" w:cs="Calibri" w:eastAsia="Calibri" w:hAnsi="Calibri"/>
-                <w:sz w:val="17"/>
-                <w:szCs w:val="17"/>
-              </w:rPr>
-              <w:t xml:space="preserve"> Dockerfile y docker-compose con PostgreSQL 16.</w:t>
+              <w:t xml:space="preserve">). Semana 3: Dockerfile y docker-compose con PostgreSQL 16.</w:t>
             </w:r>
           </w:p>
         </w:tc>
@@ -11917,20 +11333,10 @@
             <w:r>
               <w:rPr>
                 <w:rFonts w:ascii="Calibri" w:cs="Calibri" w:eastAsia="Calibri" w:hAnsi="Calibri"/>
-                <w:b/>
-                <w:bCs/>
-                <w:sz w:val="17"/>
-                <w:szCs w:val="17"/>
-              </w:rPr>
-              <w:t xml:space="preserve">DT-09</w:t>
-            </w:r>
-            <w:r>
-              <w:rPr>
-                <w:rFonts w:ascii="Calibri" w:cs="Calibri" w:eastAsia="Calibri" w:hAnsi="Calibri"/>
-                <w:sz w:val="17"/>
-                <w:szCs w:val="17"/>
-              </w:rPr>
-              <w:t xml:space="preserve"> Dos líneas del dominio sin prueba (98 % de cobertura).</w:t>
+                <w:sz w:val="17"/>
+                <w:szCs w:val="17"/>
+              </w:rPr>
+              <w:t xml:space="preserve">DT-09. Dos líneas del dominio no tienen prueba (98 % de cobertura).</w:t>
             </w:r>
           </w:p>
         </w:tc>
@@ -12054,20 +11460,10 @@
             <w:r>
               <w:rPr>
                 <w:rFonts w:ascii="Calibri" w:cs="Calibri" w:eastAsia="Calibri" w:hAnsi="Calibri"/>
-                <w:b/>
-                <w:bCs/>
-                <w:sz w:val="17"/>
-                <w:szCs w:val="17"/>
-              </w:rPr>
-              <w:t xml:space="preserve">Bajo:</w:t>
-            </w:r>
-            <w:r>
-              <w:rPr>
-                <w:rFonts w:ascii="Calibri" w:cs="Calibri" w:eastAsia="Calibri" w:hAnsi="Calibri"/>
-                <w:sz w:val="17"/>
-                <w:szCs w:val="17"/>
-              </w:rPr>
-              <w:t xml:space="preserve"> un cambio en esos caminos pasaría sin detectarse.</w:t>
+                <w:sz w:val="17"/>
+                <w:szCs w:val="17"/>
+              </w:rPr>
+              <w:t xml:space="preserve">Bajo. Si alguien cambia esos caminos, nadie se daría cuenta.</w:t>
             </w:r>
           </w:p>
         </w:tc>
@@ -12094,20 +11490,10 @@
             <w:r>
               <w:rPr>
                 <w:rFonts w:ascii="Calibri" w:cs="Calibri" w:eastAsia="Calibri" w:hAnsi="Calibri"/>
-                <w:b/>
-                <w:bCs/>
-                <w:sz w:val="17"/>
-                <w:szCs w:val="17"/>
-              </w:rPr>
-              <w:t xml:space="preserve">Semana 2:</w:t>
-            </w:r>
-            <w:r>
-              <w:rPr>
-                <w:rFonts w:ascii="Calibri" w:cs="Calibri" w:eastAsia="Calibri" w:hAnsi="Calibri"/>
-                <w:sz w:val="17"/>
-                <w:szCs w:val="17"/>
-              </w:rPr>
-              <w:t xml:space="preserve"> dos pruebas nuevas; cobertura mínima de 95 % en CI.</w:t>
+                <w:sz w:val="17"/>
+                <w:szCs w:val="17"/>
+              </w:rPr>
+              <w:t xml:space="preserve">Semana 2: dos pruebas nuevas, y cobertura mínima de 95 % en CI.</w:t>
             </w:r>
           </w:p>
         </w:tc>
@@ -12139,20 +11525,10 @@
             <w:r>
               <w:rPr>
                 <w:rFonts w:ascii="Calibri" w:cs="Calibri" w:eastAsia="Calibri" w:hAnsi="Calibri"/>
-                <w:b/>
-                <w:bCs/>
-                <w:sz w:val="17"/>
-                <w:szCs w:val="17"/>
-              </w:rPr>
-              <w:t xml:space="preserve">DT-10</w:t>
-            </w:r>
-            <w:r>
-              <w:rPr>
-                <w:rFonts w:ascii="Calibri" w:cs="Calibri" w:eastAsia="Calibri" w:hAnsi="Calibri"/>
-                <w:sz w:val="17"/>
-                <w:szCs w:val="17"/>
-              </w:rPr>
-              <w:t xml:space="preserve"> El texto oficial de autorización de datos no está redactado; el prototipo muestra un marcador.</w:t>
+                <w:sz w:val="17"/>
+                <w:szCs w:val="17"/>
+              </w:rPr>
+              <w:t xml:space="preserve">DT-10. Falta redactar el texto oficial de autorización de datos; el prototipo muestra un marcador en su lugar.</w:t>
             </w:r>
           </w:p>
         </w:tc>
@@ -12252,20 +11628,10 @@
             <w:r>
               <w:rPr>
                 <w:rFonts w:ascii="Calibri" w:cs="Calibri" w:eastAsia="Calibri" w:hAnsi="Calibri"/>
-                <w:b/>
-                <w:bCs/>
-                <w:sz w:val="17"/>
-                <w:szCs w:val="17"/>
-              </w:rPr>
-              <w:t xml:space="preserve">Alto</w:t>
-            </w:r>
-            <w:r>
-              <w:rPr>
-                <w:rFonts w:ascii="Calibri" w:cs="Calibri" w:eastAsia="Calibri" w:hAnsi="Calibri"/>
-                <w:sz w:val="17"/>
-                <w:szCs w:val="17"/>
-              </w:rPr>
-              <w:t xml:space="preserve"> antes de usar datos reales: sin texto aprobado, la autorización de la Ley 1581 no es válida.</w:t>
+                <w:sz w:val="17"/>
+                <w:szCs w:val="17"/>
+              </w:rPr>
+              <w:t xml:space="preserve">Alto antes de trabajar con datos reales: sin un texto aprobado, la autorización que pide la Ley 1581 no es válida.</w:t>
             </w:r>
           </w:p>
         </w:tc>
@@ -12292,20 +11658,10 @@
             <w:r>
               <w:rPr>
                 <w:rFonts w:ascii="Calibri" w:cs="Calibri" w:eastAsia="Calibri" w:hAnsi="Calibri"/>
-                <w:b/>
-                <w:bCs/>
-                <w:sz w:val="17"/>
-                <w:szCs w:val="17"/>
-              </w:rPr>
-              <w:t xml:space="preserve">Antes del piloto:</w:t>
-            </w:r>
-            <w:r>
-              <w:rPr>
-                <w:rFonts w:ascii="Calibri" w:cs="Calibri" w:eastAsia="Calibri" w:hAnsi="Calibri"/>
-                <w:sz w:val="17"/>
-                <w:szCs w:val="17"/>
-              </w:rPr>
-              <w:t xml:space="preserve"> redactarlo con el dueño, versionarlo en </w:t>
+                <w:sz w:val="17"/>
+                <w:szCs w:val="17"/>
+              </w:rPr>
+              <w:t xml:space="preserve">Antes del piloto: redactarlo con el dueño del gimnasio, guardarlo con versión en </w:t>
             </w:r>
             <w:r>
               <w:rPr>
@@ -12321,7 +11677,7 @@
                 <w:sz w:val="17"/>
                 <w:szCs w:val="17"/>
               </w:rPr>
-              <w:t xml:space="preserve"> y guardar con cada socio la versión aceptada.</w:t>
+              <w:t xml:space="preserve"> y registrar con cada socio qué versión aceptó.</w:t>
             </w:r>
           </w:p>
         </w:tc>
@@ -12578,7 +11934,7 @@
                 <w:sz w:val="19"/>
                 <w:szCs w:val="19"/>
               </w:rPr>
-              <w:t xml:space="preserve">El núcleo de dominio heredado está sano (complejidad promedio 1,89; 48 pruebas; 98 % de cobertura), pero solo existe una de las cuatro capas del DAD y la auditoría encontró diez ítems de deuda, siete de impacto alto. El código no estaba en control de versiones y hubo que reconstruirlo. Este semestre se agregarán persistencia, interfaz web, seguridad y despliegue, y cualquier cambio puede romper reglas de dinero (RN-03 a RN-07) sin que nadie lo note.</w:t>
+              <w:t xml:space="preserve">El núcleo de dominio que heredé está en buen estado: complejidad promedio de 1,89, 48 pruebas y 98 % de cobertura. Pero de las cuatro capas del DAD solo existe una, y la auditoría encontró diez ítems de deuda, siete de impacto alto. Además, el código no estaba en control de versiones y lo tuve que reconstruir. Este semestre voy a agregar persistencia, interfaz web, seguridad y despliegue, y cualquiera de esos cambios puede dañar una regla de dinero (RN-03 a RN-07) sin que me dé cuenta.</w:t>
             </w:r>
           </w:p>
         </w:tc>
@@ -12651,7 +12007,7 @@
                 <w:sz w:val="19"/>
                 <w:szCs w:val="19"/>
               </w:rPr>
-              <w:t xml:space="preserve">El estado auditado se congela como línea base </w:t>
+              <w:t xml:space="preserve">Congelo el estado auditado como línea base </w:t>
             </w:r>
             <w:r>
               <w:rPr>
@@ -12717,7 +12073,7 @@
                 <w:sz w:val="19"/>
                 <w:szCs w:val="19"/>
               </w:rPr>
-              <w:t xml:space="preserve"> por Pull Request y cita el ítem de deuda (DT-xx) o la solicitud de cambio que atiende.</w:t>
+              <w:t xml:space="preserve"> por Pull Request e indica qué ítem de deuda (DT-xx) o qué solicitud de cambio atiende.</w:t>
             </w:r>
           </w:p>
           <w:p>
@@ -12751,7 +12107,7 @@
                 <w:sz w:val="19"/>
                 <w:szCs w:val="19"/>
               </w:rPr>
-              <w:t xml:space="preserve"> bloquea el Pull Request si falla una prueba, si la cobertura del dominio baja de 95 %, si aparece un bloque con complejidad mayor que 10 o si ruff o bandit reportan hallazgos. SonarCloud se conecta al mismo flujo para conservar el historial de métricas.</w:t>
+              <w:t xml:space="preserve"> bloquea el Pull Request si falla una prueba, si la cobertura del dominio baja de 95 %, si aparece un bloque con complejidad mayor de 10 o si ruff o bandit encuentran algo. SonarCloud se conecta a ese mismo flujo para guardar el historial de métricas.</w:t>
             </w:r>
           </w:p>
           <w:p>
@@ -12769,7 +12125,7 @@
                 <w:sz w:val="19"/>
                 <w:szCs w:val="19"/>
               </w:rPr>
-              <w:t xml:space="preserve">El prototipo HTML se congela como referencia de experiencia de usuario y no se usa como código base.</w:t>
+              <w:t xml:space="preserve">El prototipo HTML se queda como referencia de cómo debe verse y usarse la aplicación, pero no se usa como base de código.</w:t>
             </w:r>
           </w:p>
         </w:tc>
@@ -12834,20 +12190,10 @@
             <w:r>
               <w:rPr>
                 <w:rFonts w:ascii="Calibri" w:cs="Calibri" w:eastAsia="Calibri" w:hAnsi="Calibri"/>
-                <w:b/>
-                <w:bCs/>
-                <w:sz w:val="19"/>
-                <w:szCs w:val="19"/>
-              </w:rPr>
-              <w:t xml:space="preserve">Positivas:</w:t>
-            </w:r>
-            <w:r>
-              <w:rPr>
-                <w:rFonts w:ascii="Calibri" w:cs="Calibri" w:eastAsia="Calibri" w:hAnsi="Calibri"/>
-                <w:sz w:val="19"/>
-                <w:szCs w:val="19"/>
-              </w:rPr>
-              <w:t xml:space="preserve"> la evolución se mide contra cifras objetivas; cada pago de deuda queda trazado del ítem al commit; las reglas de negocio quedan protegidas por pruebas que se ejecutan solas; se recupera la evidencia perdida con el </w:t>
+                <w:sz w:val="19"/>
+                <w:szCs w:val="19"/>
+              </w:rPr>
+              <w:t xml:space="preserve">A favor: puedo medir la evolución con cifras, cada pago de deuda queda ligado a su ítem y a su commit, las reglas de negocio quedan protegidas por pruebas que corren solas y recupero la evidencia que se perdió con el </w:t>
             </w:r>
             <w:r>
               <w:rPr>
@@ -12873,20 +12219,10 @@
             <w:r>
               <w:rPr>
                 <w:rFonts w:ascii="Calibri" w:cs="Calibri" w:eastAsia="Calibri" w:hAnsi="Calibri"/>
-                <w:b/>
-                <w:bCs/>
-                <w:sz w:val="19"/>
-                <w:szCs w:val="19"/>
-              </w:rPr>
-              <w:t xml:space="preserve">Negativas:</w:t>
-            </w:r>
-            <w:r>
-              <w:rPr>
-                <w:rFonts w:ascii="Calibri" w:cs="Calibri" w:eastAsia="Calibri" w:hAnsi="Calibri"/>
-                <w:sz w:val="19"/>
-                <w:szCs w:val="19"/>
-              </w:rPr>
-              <w:t xml:space="preserve"> cada cambio tarda un poco más (revisión y cerca de un minuto de espera del flujo). Al trabajar solo, el autor revisa su propio Pull Request y depende de la lista de verificación y de las herramientas. Los umbrales pueden frenar un arreglo urgente: se permite saltarlos solo registrando un nuevo ítem de deuda con plan de pago.</w:t>
+                <w:sz w:val="19"/>
+                <w:szCs w:val="19"/>
+              </w:rPr>
+              <w:t xml:space="preserve">En contra: cada cambio toma un poco más de tiempo, entre la revisión y casi un minuto de espera del flujo. Como trabajo solo, yo mismo reviso mis Pull Requests, así que dependo de la lista de verificación y de las herramientas. Los umbrales podrían frenar un arreglo urgente; en ese caso solo se pueden saltar si registro un nuevo ítem de deuda con su plan de pago.</w:t>
             </w:r>
           </w:p>
         </w:tc>
@@ -13061,20 +12397,10 @@
             <w:r>
               <w:rPr>
                 <w:rFonts w:ascii="Calibri" w:cs="Calibri" w:eastAsia="Calibri" w:hAnsi="Calibri"/>
-                <w:b/>
-                <w:bCs/>
-                <w:sz w:val="19"/>
-                <w:szCs w:val="19"/>
-              </w:rPr>
-              <w:t xml:space="preserve">Solo la inyección SQL.</w:t>
-            </w:r>
-            <w:r>
-              <w:rPr>
-                <w:rFonts w:ascii="Calibri" w:cs="Calibri" w:eastAsia="Calibri" w:hAnsi="Calibri"/>
-                <w:sz w:val="19"/>
-                <w:szCs w:val="19"/>
-              </w:rPr>
-              <w:t xml:space="preserve"> La corrigió con consultas parametrizadas. Afirmó haber retirado el secreto, pero lo dejó como valor por defecto de </w:t>
+                <w:sz w:val="19"/>
+                <w:szCs w:val="19"/>
+              </w:rPr>
+              <w:t xml:space="preserve">Solo la inyección SQL, que corrigió con consultas parametrizadas. Dijo que había quitado el secreto, pero lo dejó como valor por defecto de </w:t>
             </w:r>
             <w:r>
               <w:rPr>
@@ -13090,7 +12416,7 @@
                 <w:sz w:val="19"/>
                 <w:szCs w:val="19"/>
               </w:rPr>
-              <w:t xml:space="preserve">: sin la variable de entorno el sistema usa la clave filtrada (comprobado con una prueba). Tampoco vio el cobro posterior al registro, el </w:t>
+              <w:t xml:space="preserve">, y sin la variable de entorno el sistema usa la clave filtrada (lo comprobé con una prueba). Tampoco vio que cobra después de registrar, que usa </w:t>
             </w:r>
             <w:r>
               <w:rPr>
@@ -13106,30 +12432,20 @@
                 <w:sz w:val="19"/>
                 <w:szCs w:val="19"/>
               </w:rPr>
-              <w:t xml:space="preserve"> para dinero, el stock sin validar ni la llamada HTTP sin tiempo de espera (bandit B113).</w:t>
-            </w:r>
-          </w:p>
-          <w:p>
-            <w:pPr>
-              <w:spacing w:after="0"/>
-            </w:pPr>
-            <w:r>
-              <w:rPr>
-                <w:rFonts w:ascii="Calibri" w:cs="Calibri" w:eastAsia="Calibri" w:hAnsi="Calibri"/>
-                <w:b/>
-                <w:bCs/>
-                <w:sz w:val="19"/>
-                <w:szCs w:val="19"/>
-              </w:rPr>
-              <w:t xml:space="preserve">Corrección:</w:t>
-            </w:r>
-            <w:r>
-              <w:rPr>
-                <w:rFonts w:ascii="Calibri" w:cs="Calibri" w:eastAsia="Calibri" w:hAnsi="Calibri"/>
-                <w:sz w:val="19"/>
-                <w:szCs w:val="19"/>
-              </w:rPr>
-              <w:t xml:space="preserve"> </w:t>
+              <w:t xml:space="preserve"> para el dinero, que no valida el stock ni que la llamada HTTP no tiene tiempo de espera (bandit B113).</w:t>
+            </w:r>
+          </w:p>
+          <w:p>
+            <w:pPr>
+              <w:spacing w:after="0"/>
+            </w:pPr>
+            <w:r>
+              <w:rPr>
+                <w:rFonts w:ascii="Calibri" w:cs="Calibri" w:eastAsia="Calibri" w:hAnsi="Calibri"/>
+                <w:sz w:val="19"/>
+                <w:szCs w:val="19"/>
+              </w:rPr>
+              <w:t xml:space="preserve">Cómo lo corregí: </w:t>
             </w:r>
             <w:r>
               <w:rPr>
@@ -13145,7 +12461,7 @@
                 <w:sz w:val="19"/>
                 <w:szCs w:val="19"/>
               </w:rPr>
-              <w:t xml:space="preserve"> falla si la variable no existe, el cobro ocurre antes de registrar y la venta se guarda en una transacción.</w:t>
+              <w:t xml:space="preserve"> falla si la variable no existe, el cobro va antes del registro y la venta se guarda dentro de una transacción.</w:t>
             </w:r>
           </w:p>
         </w:tc>
@@ -13226,7 +12542,7 @@
                 <w:sz w:val="19"/>
                 <w:szCs w:val="19"/>
               </w:rPr>
-              <w:t xml:space="preserve"> sin errores) y todas las librerías existen, pero importa </w:t>
+              <w:t xml:space="preserve"> no da errores) y todas las librerías existen. El problema es que importa </w:t>
             </w:r>
             <w:r>
               <w:rPr>
@@ -13242,7 +12558,7 @@
                 <w:sz w:val="19"/>
                 <w:szCs w:val="19"/>
               </w:rPr>
-              <w:t xml:space="preserve"> sin usarlo (ruff F401) y falla al ejecutarse: </w:t>
+              <w:t xml:space="preserve"> sin usarlo (ruff F401) y que falla al ejecutarse: </w:t>
             </w:r>
             <w:r>
               <w:rPr>
@@ -13274,7 +12590,7 @@
                 <w:sz w:val="19"/>
                 <w:szCs w:val="19"/>
               </w:rPr>
-              <w:t xml:space="preserve"> con los precios que entrega PostgreSQL, y una referencia inexistente produce otro </w:t>
+              <w:t xml:space="preserve"> con los precios que devuelve PostgreSQL, y una referencia que no existe produce otro </w:t>
             </w:r>
             <w:r>
               <w:rPr>
@@ -13290,30 +12606,20 @@
                 <w:sz w:val="19"/>
                 <w:szCs w:val="19"/>
               </w:rPr>
-              <w:t xml:space="preserve">. Hay 5 pruebas que documentan estos defectos.</w:t>
-            </w:r>
-          </w:p>
-          <w:p>
-            <w:pPr>
-              <w:spacing w:after="0"/>
-            </w:pPr>
-            <w:r>
-              <w:rPr>
-                <w:rFonts w:ascii="Calibri" w:cs="Calibri" w:eastAsia="Calibri" w:hAnsi="Calibri"/>
-                <w:b/>
-                <w:bCs/>
-                <w:sz w:val="19"/>
-                <w:szCs w:val="19"/>
-              </w:rPr>
-              <w:t xml:space="preserve">Corrección:</w:t>
-            </w:r>
-            <w:r>
-              <w:rPr>
-                <w:rFonts w:ascii="Calibri" w:cs="Calibri" w:eastAsia="Calibri" w:hAnsi="Calibri"/>
-                <w:sz w:val="19"/>
-                <w:szCs w:val="19"/>
-              </w:rPr>
-              <w:t xml:space="preserve"> cálculo en </w:t>
+              <w:t xml:space="preserve">. Escribí 5 pruebas que muestran estos defectos.</w:t>
+            </w:r>
+          </w:p>
+          <w:p>
+            <w:pPr>
+              <w:spacing w:after="0"/>
+            </w:pPr>
+            <w:r>
+              <w:rPr>
+                <w:rFonts w:ascii="Calibri" w:cs="Calibri" w:eastAsia="Calibri" w:hAnsi="Calibri"/>
+                <w:sz w:val="19"/>
+                <w:szCs w:val="19"/>
+              </w:rPr>
+              <w:t xml:space="preserve">Cómo lo corregí: los cálculos van en </w:t>
             </w:r>
             <w:r>
               <w:rPr>
@@ -13329,7 +12635,7 @@
                 <w:sz w:val="19"/>
                 <w:szCs w:val="19"/>
               </w:rPr>
-              <w:t xml:space="preserve"> con redondeo explícito y errores de negocio (</w:t>
+              <w:t xml:space="preserve"> con redondeo explícito y hay errores de negocio (</w:t>
             </w:r>
             <w:r>
               <w:rPr>
@@ -13377,7 +12683,7 @@
                 <w:sz w:val="19"/>
                 <w:szCs w:val="19"/>
               </w:rPr>
-              <w:t xml:space="preserve">); sus 5 pruebas pasan.</w:t>
+              <w:t xml:space="preserve">). Sus 5 pruebas pasan.</w:t>
             </w:r>
           </w:p>
         </w:tc>
@@ -13442,7 +12748,7 @@
                 <w:sz w:val="19"/>
                 <w:szCs w:val="19"/>
               </w:rPr>
-              <w:t xml:space="preserve">psycopg2-binary 2.9.13: LGPL con excepciones (uso como librería permitido; el paquete </w:t>
+              <w:t xml:space="preserve">psycopg2-binary 2.9.13 tiene licencia LGPL con excepciones: se puede usar como librería, aunque el paquete </w:t>
             </w:r>
             <w:r>
               <w:rPr>
@@ -13458,30 +12764,20 @@
                 <w:sz w:val="19"/>
                 <w:szCs w:val="19"/>
               </w:rPr>
-              <w:t xml:space="preserve"> se recomienda solo para desarrollo). requests 2.34.2: Apache-2.0. Ninguna es GPL v3.</w:t>
-            </w:r>
-          </w:p>
-          <w:p>
-            <w:pPr>
-              <w:spacing w:after="0"/>
-            </w:pPr>
-            <w:r>
-              <w:rPr>
-                <w:rFonts w:ascii="Calibri" w:cs="Calibri" w:eastAsia="Calibri" w:hAnsi="Calibri"/>
-                <w:b/>
-                <w:bCs/>
-                <w:sz w:val="19"/>
-                <w:szCs w:val="19"/>
-              </w:rPr>
-              <w:t xml:space="preserve">Decisión:</w:t>
-            </w:r>
-            <w:r>
-              <w:rPr>
-                <w:rFonts w:ascii="Calibri" w:cs="Calibri" w:eastAsia="Calibri" w:hAnsi="Calibri"/>
-                <w:sz w:val="19"/>
-                <w:szCs w:val="19"/>
-              </w:rPr>
-              <w:t xml:space="preserve"> la versión corregida usa solo la biblioteca estándar. En FitManage el acceso a datos será con Django ORM (BSD-3-Clause), según el DAD.</w:t>
+              <w:t xml:space="preserve"> se recomienda solo para desarrollo. requests 2.34.2 usa Apache-2.0. Ninguna es GPL v3.</w:t>
+            </w:r>
+          </w:p>
+          <w:p>
+            <w:pPr>
+              <w:spacing w:after="0"/>
+            </w:pPr>
+            <w:r>
+              <w:rPr>
+                <w:rFonts w:ascii="Calibri" w:cs="Calibri" w:eastAsia="Calibri" w:hAnsi="Calibri"/>
+                <w:sz w:val="19"/>
+                <w:szCs w:val="19"/>
+              </w:rPr>
+              <w:t xml:space="preserve">Decisión: la versión corregida usa solo la biblioteca estándar. En FitManage el acceso a datos se hará con Django ORM (BSD-3-Clause), como indica el DAD.</w:t>
             </w:r>
           </w:p>
         </w:tc>
@@ -13546,7 +12842,7 @@
                 <w:sz w:val="19"/>
                 <w:szCs w:val="19"/>
               </w:rPr>
-              <w:t xml:space="preserve">Solo se envió el fragmento ficticio de la guía; ningún dato ni código de FitManage. Las pruebas usan «Cliente Ficticio» y la cédula </w:t>
+              <w:t xml:space="preserve">Solo envié el fragmento ficticio de la guía, sin datos ni código de FitManage. Las pruebas usan «Cliente Ficticio» y la cédula </w:t>
             </w:r>
             <w:r>
               <w:rPr>
@@ -13575,7 +12871,7 @@
                 <w:sz w:val="19"/>
                 <w:szCs w:val="19"/>
               </w:rPr>
-              <w:t xml:space="preserve">Regla del proyecto: nunca se pegan filas reales en una IA; se usan datos sintéticos, solo el esquema y el código, y el diseño guarda </w:t>
+              <w:t xml:space="preserve">Regla del proyecto: nunca pego filas reales en una IA. Uso datos inventados y comparto solo el esquema y el código. Además, el diseño guarda </w:t>
             </w:r>
             <w:r>
               <w:rPr>
@@ -13591,7 +12887,7 @@
                 <w:sz w:val="19"/>
                 <w:szCs w:val="19"/>
               </w:rPr>
-              <w:t xml:space="preserve"> en lugar de repetir nombre y cédula en cada registro.</w:t>
+              <w:t xml:space="preserve"> en vez de repetir el nombre y la cédula en cada registro.</w:t>
             </w:r>
           </w:p>
         </w:tc>
@@ -13676,7 +12972,7 @@
               <w:rPr>
                 <w:rFonts w:ascii="Calibri" w:cs="Calibri" w:eastAsia="Calibri" w:hAnsi="Calibri"/>
               </w:rPr>
-              <w:t xml:space="preserve">Aprendí que heredar un sistema, aunque sea el propio, exige medirlo antes de tocarlo. La línea base convierte impresiones como «el código está bien» en cifras verificables: complejidad promedio 1,89, 48 pruebas, 98 % de cobertura y cero hallazgos de seguridad en el dominio, pero también una función de complejidad 23 en el prototipo, reglas de negocio duplicadas y un control de acceso que solo existe en el navegador. Clasificar cada ítem con el cuadrante de Fowler mostró que la deuda más peligrosa no era la que se tomó a sabiendas y se registró (DT-01 a DT-03), sino la que nunca se registró: el prototipo y la falta de control de versiones, que terminó en la pérdida del código. Y también aprendí que la IA puede corregir bien la estructura y, al mismo tiempo, afirmar con seguridad algo falso, como que el secreto ya no estaba expuesto.</w:t>
+              <w:t xml:space="preserve">Aprendí que un sistema heredado, aunque lo haya escrito yo, hay que medirlo antes de tocarlo. Yo creía que el código estaba bien, y la línea base lo confirmó solo en parte. El dominio salió con complejidad promedio de 1,89, 48 pruebas, 98 % de cobertura y ningún hallazgo de seguridad. En el prototipo, en cambio, apareció una función con complejidad 23, reglas de negocio repetidas y un control de acceso que solo existe en el navegador. Al clasificar cada ítem con el cuadrante de Fowler vi que las deudas que había anotado a conciencia (DT-01 a DT-03) eran las menos peligrosas. Las peores fueron las que nunca registré: el prototipo y la falta de control de versiones, que terminó con el código perdido. Con la IA me llevé otra lección: puede arreglar bien la estructura y, en la misma respuesta, asegurar algo falso, como que el secreto ya no estaba expuesto.</w:t>
             </w:r>
           </w:p>
         </w:tc>
@@ -13747,7 +13043,7 @@
               <w:rPr>
                 <w:rFonts w:ascii="Calibri" w:cs="Calibri" w:eastAsia="Calibri" w:hAnsi="Calibri"/>
               </w:rPr>
-              <w:t xml:space="preserve">El diagnóstico define el orden de trabajo del semestre. Primero se pagan las deudas baratas y de alto interés del dominio (DT-07 zona horaria, DT-09 pruebas faltantes y DT-03 validaciones, en la semana 2). Después, la deuda que depende de la arquitectura (DT-01, DT-02, DT-04 y DT-05) se resuelve al construir las capas de infraestructura y presentación que elegiré en la siguiente guía. Ningún cambio entra a </w:t>
+              <w:t xml:space="preserve">El diagnóstico me dice en qué orden trabajar este semestre. En la semana 2 pago las deudas del dominio que son baratas y tienen mucho interés: DT-07 (zona horaria), DT-09 (pruebas que faltan) y DT-03 (validaciones). Las que dependen de la arquitectura (DT-01, DT-02, DT-04 y DT-05) las resolveré cuando construya las capas de infraestructura y presentación que voy a escoger en la siguiente guía. Ningún cambio entra a </w:t>
             </w:r>
             <w:r>
               <w:rPr>
@@ -13775,7 +13071,7 @@
               <w:rPr>
                 <w:rFonts w:ascii="Calibri" w:cs="Calibri" w:eastAsia="Calibri" w:hAnsi="Calibri"/>
               </w:rPr>
-              <w:t xml:space="preserve"> ni sin citar el ítem que paga, y el prototipo deja de ser una fuente de código: solo es la referencia visual. Así la evolución del MVP se podrá demostrar comparando cada nueva medición contra </w:t>
+              <w:t xml:space="preserve"> y sin decir qué ítem paga. El prototipo deja de ser fuente de código y queda solo como referencia visual. Así, para demostrar que el MVP mejoró, me basta comparar cada nueva medición con </w:t>
             </w:r>
             <w:r>
               <w:rPr>
@@ -13937,7 +13233,7 @@
                 <w:sz w:val="19"/>
                 <w:szCs w:val="19"/>
               </w:rPr>
-              <w:t xml:space="preserve">Congelar el estado auditado como línea base </w:t>
+              <w:t xml:space="preserve">Dejar el estado auditado como línea base </w:t>
             </w:r>
             <w:r>
               <w:rPr>
@@ -13953,7 +13249,7 @@
                 <w:sz w:val="19"/>
                 <w:szCs w:val="19"/>
               </w:rPr>
-              <w:t xml:space="preserve"> en GitHub y no volver a guardar código fuera del repositorio.</w:t>
+              <w:t xml:space="preserve"> en GitHub y no volver a guardar código por fuera del repositorio.</w:t>
             </w:r>
           </w:p>
         </w:tc>
@@ -13983,7 +13279,7 @@
                 <w:sz w:val="19"/>
                 <w:szCs w:val="19"/>
               </w:rPr>
-              <w:t xml:space="preserve">La pérdida del </w:t>
+              <w:t xml:space="preserve">Con la pérdida del </w:t>
             </w:r>
             <w:r>
               <w:rPr>
@@ -13999,7 +13295,7 @@
                 <w:sz w:val="19"/>
                 <w:szCs w:val="19"/>
               </w:rPr>
-              <w:t xml:space="preserve"> demostró que sin control de versiones no hay evidencia ni forma de volver atrás; la ISO/IEC/IEEE 12207 exige una línea base formal antes del mantenimiento.</w:t>
+              <w:t xml:space="preserve"> quedó claro que sin control de versiones no hay evidencia ni manera de volver atrás. Además, la ISO/IEC/IEEE 12207 pide una línea base formal antes de cualquier mantenimiento.</w:t>
             </w:r>
           </w:p>
         </w:tc>
@@ -14050,7 +13346,7 @@
                 <w:sz w:val="19"/>
                 <w:szCs w:val="19"/>
               </w:rPr>
-              <w:t xml:space="preserve"> todo Pull Request que no pase pruebas, cobertura ≥ 95 %, complejidad ≤ 10, ruff y bandit.</w:t>
+              <w:t xml:space="preserve"> todo Pull Request que no pase las pruebas, la cobertura de 95 %, la complejidad máxima de 10, ruff y bandit.</w:t>
             </w:r>
           </w:p>
         </w:tc>
@@ -14080,7 +13376,7 @@
                 <w:sz w:val="19"/>
                 <w:szCs w:val="19"/>
               </w:rPr>
-              <w:t xml:space="preserve">Impide que la deuda crezca en silencio mientras se agregan capas, y deja la verificación en manos de herramientas objetivas, lo que importa más al trabajar solo.</w:t>
+              <w:t xml:space="preserve">Así la deuda no crece sin que yo lo note mientras agrego capas, y la revisión depende de herramientas y no de mi criterio del momento. Eso pesa más porque trabajo solo.</w:t>
             </w:r>
           </w:p>
         </w:tc>
@@ -14145,7 +13441,7 @@
                 <w:sz w:val="19"/>
                 <w:szCs w:val="19"/>
               </w:rPr>
-              <w:t xml:space="preserve">Refactorizar un prototipo desechable sin pruebas costaría más que reemplazarlo; lo valioso de él es la experiencia de usuario validada, no su JavaScript.</w:t>
+              <w:t xml:space="preserve">Refactorizar un prototipo desechable que no tiene pruebas costaría más que reemplazarlo. Lo que me sirve de él es la experiencia de usuario que ya validé, y esa la conservo.</w:t>
             </w:r>
           </w:p>
         </w:tc>
@@ -14227,7 +13523,7 @@
         <w:rPr>
           <w:rFonts w:ascii="Calibri" w:cs="Calibri" w:eastAsia="Calibri" w:hAnsi="Calibri"/>
         </w:rPr>
-        <w:t xml:space="preserve">☑  Otra evidencia: repositorio https://github.com/GAMERO29/FitManage con la etiqueta </w:t>
+        <w:t xml:space="preserve">☑  Otra evidencia: el repositorio https://github.com/GAMERO29/FitManage, con la etiqueta </w:t>
       </w:r>
       <w:r>
         <w:rPr>
@@ -14269,7 +13565,7 @@
         <w:rPr>
           <w:rFonts w:ascii="Calibri" w:cs="Calibri" w:eastAsia="Calibri" w:hAnsi="Calibri"/>
         </w:rPr>
-        <w:t xml:space="preserve"> (métricas y cómo reproducirlas), </w:t>
+        <w:t xml:space="preserve"> (las métricas y cómo repetirlas), </w:t>
       </w:r>
       <w:r>
         <w:rPr>
@@ -14311,7 +13607,7 @@
         <w:rPr>
           <w:rFonts w:ascii="Calibri" w:cs="Calibri" w:eastAsia="Calibri" w:hAnsi="Calibri"/>
         </w:rPr>
-        <w:t xml:space="preserve"> (prompt, respuesta de la IA y 10 pruebas de la auditoría).</w:t>
+        <w:t xml:space="preserve"> (el prompt, la respuesta de la IA y 10 pruebas de la auditoría).</w:t>
       </w:r>
     </w:p>
     <w:p>
@@ -14379,7 +13675,7 @@
               <w:rPr>
                 <w:rFonts w:ascii="Calibri" w:cs="Calibri" w:eastAsia="Calibri" w:hAnsi="Calibri"/>
               </w:rPr>
-              <w:t xml:space="preserve">Lo más difícil fue clasificar con honestidad la deuda del prototipo. Era tentador llamarla «deliberada y prudente» porque siempre se supo que era una demostración, pero nunca se registró en el backlog ni tuvo plan de pago, así que según Fowler es deliberada e imprudente. También costó aceptar la pérdida del </w:t>
+              <w:t xml:space="preserve">Lo que más me costó fue clasificar con honestidad la deuda del prototipo. Me tentaba llamarla «deliberada y prudente» porque siempre supe que era una demostración, pero nunca la anoté en el backlog ni le puse un plan de pago, así que según Fowler es deliberada e imprudente. También me costó aceptar que había perdido el </w:t>
             </w:r>
             <w:r>
               <w:rPr>
@@ -14393,7 +13689,7 @@
               <w:rPr>
                 <w:rFonts w:ascii="Calibri" w:cs="Calibri" w:eastAsia="Calibri" w:hAnsi="Calibri"/>
               </w:rPr>
-              <w:t xml:space="preserve">: reconstruir el núcleo a partir de la FPI-12 fue posible gracias a que las reglas y las pruebas estaban bien documentadas, pero la historia de commits original no se recupera. Como trabajo solo, no hubo debate de equipo; la discusión fue contra las herramientas, que contradijeron mi impresión inicial de que «todo estaba bien» y además mostraron que también fallan: bandit no detectó la clave de PayU del fragmento legado.</w:t>
+              <w:t xml:space="preserve">. Pude reconstruir el núcleo porque las reglas y las pruebas estaban bien documentadas en la FPI-12, pero el historial de commits original ya no se puede recuperar. Como trabajo solo, no hubo discusiones de equipo. Las discusiones fueron con las herramientas: me mostraron que el código no estaba tan bien como yo creía, y también que ellas fallan, porque bandit no detectó la clave de PayU en el fragmento legado.</w:t>
             </w:r>
           </w:p>
         </w:tc>
@@ -14469,7 +13765,7 @@
               <w:rPr>
                 <w:rFonts w:ascii="Calibri" w:cs="Calibri" w:eastAsia="Calibri" w:hAnsi="Calibri"/>
               </w:rPr>
-              <w:t xml:space="preserve">Pagar en Pull Requests separados las deudas de la semana 2 (DT-07, DT-09 y DT-03), cada uno citando su ítem.</w:t>
+              <w:t xml:space="preserve">Pagar en Pull Requests separados las deudas de la semana 2 (DT-07, DT-09 y DT-03), indicando en cada uno qué ítem paga.</w:t>
             </w:r>
           </w:p>
           <w:p>
@@ -14559,7 +13855,7 @@
               <w:rPr>
                 <w:rFonts w:ascii="Calibri" w:cs="Calibri" w:eastAsia="Calibri" w:hAnsi="Calibri"/>
               </w:rPr>
-              <w:t xml:space="preserve">Preparar la comparación de estilos arquitectónicos (capas, hexagonal y monolito modular) frente a DT-01, DT-02, DT-04 y DT-05, que dependen de la arquitectura elegida en la siguiente guía.</w:t>
+              <w:t xml:space="preserve">Comparar los estilos de arquitectura (capas, hexagonal y monolito modular) frente a DT-01, DT-02, DT-04 y DT-05, que dependen de la arquitectura que escoja en la siguiente guía.</w:t>
             </w:r>
           </w:p>
         </w:tc>

</xml_diff>